<commit_message>
home... lidle code changes and adjust developer menual
</commit_message>
<xml_diff>
--- a/Stitchi_1/Developer_Guide_Stitchi1.0.docx
+++ b/Stitchi_1/Developer_Guide_Stitchi1.0.docx
@@ -14,6 +14,9 @@
       <w:proofErr w:type="spellEnd"/>
       <w:r>
         <w:t xml:space="preserve"> 1.0 — Developer Guide</w:t>
+      </w:r>
+      <w:r>
+        <w:t xml:space="preserve"> V1.1</w:t>
       </w:r>
     </w:p>
     <w:p>
@@ -5865,68 +5868,6 @@
           <w:numId w:val="0"/>
         </w:numPr>
       </w:pPr>
-    </w:p>
-    <w:p>
-      <w:pPr>
-        <w:pStyle w:val="Aufzhlungszeichen"/>
-        <w:numPr>
-          <w:ilvl w:val="0"/>
-          <w:numId w:val="0"/>
-        </w:numPr>
-        <w:rPr>
-          <w:rStyle w:val="Fett"/>
-        </w:rPr>
-      </w:pPr>
-      <w:r>
-        <w:rPr>
-          <w:rStyle w:val="Fett"/>
-        </w:rPr>
-        <w:t>N</w:t>
-      </w:r>
-      <w:r>
-        <w:rPr>
-          <w:rStyle w:val="Fett"/>
-        </w:rPr>
-        <w:t>otice</w:t>
-      </w:r>
-    </w:p>
-    <w:p>
-      <w:pPr>
-        <w:pStyle w:val="Aufzhlungszeichen"/>
-        <w:numPr>
-          <w:ilvl w:val="0"/>
-          <w:numId w:val="0"/>
-        </w:numPr>
-      </w:pPr>
-      <w:r>
-        <w:t xml:space="preserve">In file </w:t>
-      </w:r>
-      <w:r>
-        <w:t>‘angle_handler.py’</w:t>
-      </w:r>
-      <w:r>
-        <w:t xml:space="preserve">, within function </w:t>
-      </w:r>
-      <w:r>
-        <w:t>‘</w:t>
-      </w:r>
-      <w:proofErr w:type="spellStart"/>
-      <w:r>
-        <w:t>rey_tracing_to_room_border</w:t>
-      </w:r>
-      <w:proofErr w:type="spellEnd"/>
-      <w:r>
-        <w:t>’</w:t>
-      </w:r>
-      <w:r>
-        <w:t xml:space="preserve"> at line </w:t>
-      </w:r>
-      <w:r>
-        <w:t>134</w:t>
-      </w:r>
-      <w:r>
-        <w:t>, there is a note regarding a potential inconsistency in the processing of three-dimensional coordinates. This has only been corrected provisionally and should be reviewed again.</w:t>
-      </w:r>
     </w:p>
     <w:sectPr>
       <w:pgSz w:w="12240" w:h="15840"/>
@@ -6755,6 +6696,7 @@
   <w:style w:type="character" w:default="1" w:styleId="Absatz-Standardschriftart">
     <w:name w:val="Default Paragraph Font"/>
     <w:uiPriority w:val="1"/>
+    <w:semiHidden/>
     <w:unhideWhenUsed/>
   </w:style>
   <w:style w:type="table" w:default="1" w:styleId="NormaleTabelle">

</xml_diff>

<commit_message>
home... change menuals and readmy for better start up discription
</commit_message>
<xml_diff>
--- a/Stitchi_1/Developer_Guide_Stitchi1.0.docx
+++ b/Stitchi_1/Developer_Guide_Stitchi1.0.docx
@@ -7,13 +7,8 @@
         <w:pStyle w:val="Titel"/>
         <w:jc w:val="center"/>
       </w:pPr>
-      <w:proofErr w:type="spellStart"/>
       <w:r>
-        <w:t>Stitchi</w:t>
-      </w:r>
-      <w:proofErr w:type="spellEnd"/>
-      <w:r>
-        <w:t xml:space="preserve"> 1.0 — Developer Guide</w:t>
+        <w:t>Stitchi 1.0 — Developer Guide</w:t>
       </w:r>
       <w:r>
         <w:t xml:space="preserve"> V1.1</w:t>
@@ -111,15 +106,7 @@
               <w:cnfStyle w:val="000000100000" w:firstRow="0" w:lastRow="0" w:firstColumn="0" w:lastColumn="0" w:oddVBand="0" w:evenVBand="0" w:oddHBand="1" w:evenHBand="0" w:firstRowFirstColumn="0" w:firstRowLastColumn="0" w:lastRowFirstColumn="0" w:lastRowLastColumn="0"/>
             </w:pPr>
             <w:r>
-              <w:t>Windows PowerShell; virtual environment shown as `(</w:t>
-            </w:r>
-            <w:proofErr w:type="spellStart"/>
-            <w:r>
-              <w:t>venv</w:t>
-            </w:r>
-            <w:proofErr w:type="spellEnd"/>
-            <w:r>
-              <w:t>)`</w:t>
+              <w:t>Windows PowerShell; virtual environment shown as `(venv)`</w:t>
             </w:r>
           </w:p>
         </w:tc>
@@ -206,29 +193,8 @@
             <w:pPr>
               <w:cnfStyle w:val="000000000000" w:firstRow="0" w:lastRow="0" w:firstColumn="0" w:lastColumn="0" w:oddVBand="0" w:evenVBand="0" w:oddHBand="0" w:evenHBand="0" w:firstRowFirstColumn="0" w:firstRowLastColumn="0" w:lastRowFirstColumn="0" w:lastRowLastColumn="0"/>
             </w:pPr>
-            <w:proofErr w:type="spellStart"/>
-            <w:r>
-              <w:t>opencv</w:t>
-            </w:r>
-            <w:proofErr w:type="spellEnd"/>
-            <w:r>
-              <w:t xml:space="preserve">-python 4.13.0.92; </w:t>
-            </w:r>
-            <w:proofErr w:type="spellStart"/>
-            <w:r>
-              <w:t>opencv</w:t>
-            </w:r>
-            <w:proofErr w:type="spellEnd"/>
-            <w:r>
-              <w:t>-</w:t>
-            </w:r>
-            <w:proofErr w:type="spellStart"/>
-            <w:r>
-              <w:t>contrib</w:t>
-            </w:r>
-            <w:proofErr w:type="spellEnd"/>
-            <w:r>
-              <w:t>-python 4.13.0.92</w:t>
+            <w:r>
+              <w:t>opencv-python 4.13.0.92; opencv-contrib-python 4.13.0.92</w:t>
             </w:r>
           </w:p>
         </w:tc>
@@ -316,37 +282,8 @@
             <w:pPr>
               <w:cnfStyle w:val="000000100000" w:firstRow="0" w:lastRow="0" w:firstColumn="0" w:lastColumn="0" w:oddVBand="0" w:evenVBand="0" w:oddHBand="1" w:evenHBand="0" w:firstRowFirstColumn="0" w:firstRowLastColumn="0" w:lastRowFirstColumn="0" w:lastRowLastColumn="0"/>
             </w:pPr>
-            <w:proofErr w:type="spellStart"/>
-            <w:r>
-              <w:t>protobuf</w:t>
-            </w:r>
-            <w:proofErr w:type="spellEnd"/>
-            <w:r>
-              <w:t xml:space="preserve"> 3.20.3; </w:t>
-            </w:r>
-            <w:proofErr w:type="spellStart"/>
-            <w:r>
-              <w:t>absl-py</w:t>
-            </w:r>
-            <w:proofErr w:type="spellEnd"/>
-            <w:r>
-              <w:t xml:space="preserve"> 2.4.0; </w:t>
-            </w:r>
-            <w:proofErr w:type="spellStart"/>
-            <w:r>
-              <w:t>attrs</w:t>
-            </w:r>
-            <w:proofErr w:type="spellEnd"/>
-            <w:r>
-              <w:t xml:space="preserve"> 25.4.0; Pillow 12.1.1; requests 2.34.2; </w:t>
-            </w:r>
-            <w:proofErr w:type="spellStart"/>
-            <w:r>
-              <w:t>jsonschema</w:t>
-            </w:r>
-            <w:proofErr w:type="spellEnd"/>
-            <w:r>
-              <w:t xml:space="preserve"> 4.26.0</w:t>
+            <w:r>
+              <w:t>protobuf 3.20.3; absl-py 2.4.0; attrs 25.4.0; Pillow 12.1.1; requests 2.34.2; jsonschema 4.26.0</w:t>
             </w:r>
           </w:p>
         </w:tc>
@@ -375,31 +312,7 @@
               <w:cnfStyle w:val="000000000000" w:firstRow="0" w:lastRow="0" w:firstColumn="0" w:lastColumn="0" w:oddVBand="0" w:evenVBand="0" w:oddHBand="0" w:evenHBand="0" w:firstRowFirstColumn="0" w:firstRowLastColumn="0" w:lastRowFirstColumn="0" w:lastRowLastColumn="0"/>
             </w:pPr>
             <w:r>
-              <w:t>Must support `</w:t>
-            </w:r>
-            <w:proofErr w:type="spellStart"/>
-            <w:r>
-              <w:t>udpport</w:t>
-            </w:r>
-            <w:proofErr w:type="spellEnd"/>
-            <w:r>
-              <w:t>`, `</w:t>
-            </w:r>
-            <w:proofErr w:type="spellStart"/>
-            <w:r>
-              <w:t>jsonencode</w:t>
-            </w:r>
-            <w:proofErr w:type="spellEnd"/>
-            <w:r>
-              <w:t>`, `</w:t>
-            </w:r>
-            <w:proofErr w:type="spellStart"/>
-            <w:r>
-              <w:t>jsondecode</w:t>
-            </w:r>
-            <w:proofErr w:type="spellEnd"/>
-            <w:r>
-              <w:t>`, and the string APIs used by the scripts. The exact MATLAB release was not provided.</w:t>
+              <w:t>Must support `udpport`, `jsonencode`, `jsondecode`, and the string APIs used by the scripts. The exact MATLAB release was not provided.</w:t>
             </w:r>
           </w:p>
         </w:tc>
@@ -453,16 +366,11 @@
       </w:r>
     </w:p>
     <w:p>
-      <w:proofErr w:type="gramStart"/>
       <w:r>
         <w:t>All</w:t>
       </w:r>
       <w:r>
-        <w:t xml:space="preserve"> of</w:t>
-      </w:r>
-      <w:proofErr w:type="gramEnd"/>
-      <w:r>
-        <w:t xml:space="preserve"> the other packages listed by pip are indirect dependencies that </w:t>
+        <w:t xml:space="preserve"> of the other packages listed by pip are indirect dependencies that </w:t>
       </w:r>
       <w:r>
         <w:t>should</w:t>
@@ -474,323 +382,19 @@
         <w:t xml:space="preserve"> </w:t>
       </w:r>
       <w:r>
-        <w:t xml:space="preserve">The full pip list supplied with the project also included: </w:t>
-      </w:r>
-      <w:proofErr w:type="spellStart"/>
-      <w:r>
-        <w:t>asttokens</w:t>
-      </w:r>
-      <w:proofErr w:type="spellEnd"/>
-      <w:r>
-        <w:t xml:space="preserve"> 3.0.1, </w:t>
-      </w:r>
-      <w:proofErr w:type="spellStart"/>
-      <w:r>
-        <w:t>backcall</w:t>
-      </w:r>
-      <w:proofErr w:type="spellEnd"/>
-      <w:r>
-        <w:t xml:space="preserve"> 0.2.0, beautifulsoup4 4.15.0, bleach 6.4.0, </w:t>
-      </w:r>
-      <w:proofErr w:type="spellStart"/>
-      <w:r>
-        <w:t>certifi</w:t>
-      </w:r>
-      <w:proofErr w:type="spellEnd"/>
-      <w:r>
-        <w:t xml:space="preserve"> 2026.6.17, </w:t>
-      </w:r>
-      <w:proofErr w:type="spellStart"/>
-      <w:r>
-        <w:t>cffi</w:t>
-      </w:r>
-      <w:proofErr w:type="spellEnd"/>
-      <w:r>
-        <w:t xml:space="preserve"> 2.0.0, charset-normalizer 3.4.7, </w:t>
-      </w:r>
-      <w:proofErr w:type="spellStart"/>
-      <w:r>
-        <w:t>colorama</w:t>
-      </w:r>
-      <w:proofErr w:type="spellEnd"/>
-      <w:r>
-        <w:t xml:space="preserve"> 0.4.6, </w:t>
-      </w:r>
-      <w:proofErr w:type="spellStart"/>
-      <w:r>
-        <w:t>contourpy</w:t>
-      </w:r>
-      <w:proofErr w:type="spellEnd"/>
-      <w:r>
-        <w:t xml:space="preserve"> 1.3.3, cycler 0.12.1, decorator 5.3.1, </w:t>
-      </w:r>
-      <w:proofErr w:type="spellStart"/>
-      <w:r>
-        <w:t>defusedxml</w:t>
-      </w:r>
-      <w:proofErr w:type="spellEnd"/>
-      <w:r>
-        <w:t xml:space="preserve"> 0.7.1, </w:t>
-      </w:r>
-      <w:proofErr w:type="spellStart"/>
-      <w:r>
-        <w:t>docopt</w:t>
-      </w:r>
-      <w:proofErr w:type="spellEnd"/>
-      <w:r>
-        <w:t xml:space="preserve"> 0.6.2, executing 2.2.1, </w:t>
-      </w:r>
-      <w:proofErr w:type="spellStart"/>
-      <w:r>
-        <w:t>fastjsonschema</w:t>
-      </w:r>
-      <w:proofErr w:type="spellEnd"/>
-      <w:r>
-        <w:t xml:space="preserve"> 2.21.2, </w:t>
-      </w:r>
-      <w:proofErr w:type="spellStart"/>
-      <w:r>
-        <w:t>flatbuffers</w:t>
-      </w:r>
-      <w:proofErr w:type="spellEnd"/>
-      <w:r>
-        <w:t xml:space="preserve"> 25.12.19, </w:t>
-      </w:r>
-      <w:proofErr w:type="spellStart"/>
-      <w:r>
-        <w:t>fonttools</w:t>
-      </w:r>
-      <w:proofErr w:type="spellEnd"/>
-      <w:r>
-        <w:t xml:space="preserve"> 4.61.1, </w:t>
-      </w:r>
-      <w:proofErr w:type="spellStart"/>
-      <w:r>
-        <w:t>idna</w:t>
-      </w:r>
-      <w:proofErr w:type="spellEnd"/>
-      <w:r>
-        <w:t xml:space="preserve"> 3.18, </w:t>
-      </w:r>
-      <w:proofErr w:type="spellStart"/>
-      <w:r>
-        <w:t>IPython</w:t>
-      </w:r>
-      <w:proofErr w:type="spellEnd"/>
-      <w:r>
-        <w:t xml:space="preserve"> 8.12.3, jedi 0.20.0, Jinja2 3.1.6, </w:t>
-      </w:r>
-      <w:proofErr w:type="spellStart"/>
-      <w:r>
-        <w:t>jsonschema</w:t>
-      </w:r>
-      <w:proofErr w:type="spellEnd"/>
-      <w:r>
-        <w:t xml:space="preserve">-specifications 2025.9.1, </w:t>
-      </w:r>
-      <w:proofErr w:type="spellStart"/>
-      <w:r>
-        <w:t>kiwisolver</w:t>
-      </w:r>
-      <w:proofErr w:type="spellEnd"/>
-      <w:r>
-        <w:t xml:space="preserve"> 1.4.9, </w:t>
-      </w:r>
-      <w:proofErr w:type="spellStart"/>
-      <w:r>
-        <w:t>MarkupSafe</w:t>
-      </w:r>
-      <w:proofErr w:type="spellEnd"/>
-      <w:r>
-        <w:t xml:space="preserve"> 3.0.3, </w:t>
+        <w:t xml:space="preserve">The full pip list supplied with the project also included: asttokens 3.0.1, backcall 0.2.0, beautifulsoup4 4.15.0, bleach 6.4.0, certifi 2026.6.17, cffi 2.0.0, charset-normalizer 3.4.7, colorama 0.4.6, contourpy 1.3.3, cycler 0.12.1, decorator 5.3.1, defusedxml 0.7.1, docopt 0.6.2, executing 2.2.1, fastjsonschema 2.21.2, flatbuffers 25.12.19, fonttools 4.61.1, idna 3.18, IPython 8.12.3, jedi 0.20.0, Jinja2 3.1.6, jsonschema-specifications 2025.9.1, kiwisolver 1.4.9, MarkupSafe 3.0.3, </w:t>
       </w:r>
       <w:r>
         <w:t xml:space="preserve">Matplotlib 3.10.8, </w:t>
       </w:r>
       <w:r>
-        <w:t xml:space="preserve">mistune 3.3.2, </w:t>
-      </w:r>
-      <w:proofErr w:type="spellStart"/>
-      <w:r>
-        <w:t>nbclient</w:t>
-      </w:r>
-      <w:proofErr w:type="spellEnd"/>
-      <w:r>
-        <w:t xml:space="preserve"> 0.11.0, </w:t>
-      </w:r>
-      <w:proofErr w:type="spellStart"/>
-      <w:r>
-        <w:t>nbconvert</w:t>
-      </w:r>
-      <w:proofErr w:type="spellEnd"/>
-      <w:r>
-        <w:t xml:space="preserve"> 7.17.1, </w:t>
-      </w:r>
-      <w:proofErr w:type="spellStart"/>
-      <w:r>
-        <w:t>nbformat</w:t>
-      </w:r>
-      <w:proofErr w:type="spellEnd"/>
-      <w:r>
-        <w:t xml:space="preserve"> 5.10.0, packaging 26.0, </w:t>
-      </w:r>
-      <w:proofErr w:type="spellStart"/>
-      <w:r>
-        <w:t>pandocfilters</w:t>
-      </w:r>
-      <w:proofErr w:type="spellEnd"/>
-      <w:r>
-        <w:t xml:space="preserve"> 1.5.1, </w:t>
-      </w:r>
-      <w:proofErr w:type="spellStart"/>
-      <w:r>
-        <w:t>parso</w:t>
-      </w:r>
-      <w:proofErr w:type="spellEnd"/>
-      <w:r>
-        <w:t xml:space="preserve"> 0.8.7, </w:t>
-      </w:r>
-      <w:proofErr w:type="spellStart"/>
-      <w:r>
-        <w:t>pickleshare</w:t>
-      </w:r>
-      <w:proofErr w:type="spellEnd"/>
-      <w:r>
-        <w:t xml:space="preserve"> 0.2.2, pip 26.1.2, </w:t>
-      </w:r>
-      <w:proofErr w:type="spellStart"/>
-      <w:r>
-        <w:t>pipreqs</w:t>
-      </w:r>
-      <w:proofErr w:type="spellEnd"/>
-      <w:r>
-        <w:t xml:space="preserve"> 0.5.0, </w:t>
-      </w:r>
-      <w:proofErr w:type="spellStart"/>
-      <w:r>
-        <w:t>platformdirs</w:t>
-      </w:r>
-      <w:proofErr w:type="spellEnd"/>
-      <w:r>
-        <w:t xml:space="preserve"> 4.10.0, prompt-toolkit 3.0.52, pure-eval 0.2.3, </w:t>
-      </w:r>
-      <w:proofErr w:type="spellStart"/>
-      <w:r>
-        <w:t>Pygments</w:t>
-      </w:r>
-      <w:proofErr w:type="spellEnd"/>
-      <w:r>
-        <w:t xml:space="preserve"> 2.20.0, </w:t>
-      </w:r>
-      <w:proofErr w:type="spellStart"/>
-      <w:r>
-        <w:t>pycparser</w:t>
-      </w:r>
-      <w:proofErr w:type="spellEnd"/>
-      <w:r>
-        <w:t xml:space="preserve"> 3.0, </w:t>
-      </w:r>
-      <w:proofErr w:type="spellStart"/>
-      <w:r>
-        <w:t>pyparsing</w:t>
-      </w:r>
-      <w:proofErr w:type="spellEnd"/>
-      <w:r>
-        <w:t xml:space="preserve"> 3.3.2, python-</w:t>
-      </w:r>
-      <w:proofErr w:type="spellStart"/>
-      <w:r>
-        <w:t>dateutil</w:t>
-      </w:r>
-      <w:proofErr w:type="spellEnd"/>
-      <w:r>
-        <w:t xml:space="preserve"> 2.9.0.post0, </w:t>
-      </w:r>
-      <w:proofErr w:type="spellStart"/>
-      <w:r>
-        <w:t>pyzmq</w:t>
-      </w:r>
-      <w:proofErr w:type="spellEnd"/>
-      <w:r>
-        <w:t xml:space="preserve"> 27.1.0, referencing 0.37.0, </w:t>
-      </w:r>
-      <w:proofErr w:type="spellStart"/>
-      <w:r>
-        <w:t>rpds-py</w:t>
-      </w:r>
-      <w:proofErr w:type="spellEnd"/>
-      <w:r>
-        <w:t xml:space="preserve"> 2026.6.3, </w:t>
-      </w:r>
-      <w:proofErr w:type="spellStart"/>
-      <w:r>
-        <w:t>setuptools</w:t>
-      </w:r>
-      <w:proofErr w:type="spellEnd"/>
-      <w:r>
-        <w:t xml:space="preserve"> 65.5.0, six 1.17.0,</w:t>
+        <w:t>mistune 3.3.2, nbclient 0.11.0, nbconvert 7.17.1, nbformat 5.10.0, packaging 26.0, pandocfilters 1.5.1, parso 0.8.7, pickleshare 0.2.2, pip 26.1.2, pipreqs 0.5.0, platformdirs 4.10.0, prompt-toolkit 3.0.52, pure-eval 0.2.3, Pygments 2.20.0, pycparser 3.0, pyparsing 3.3.2, python-dateutil 2.9.0.post0, pyzmq 27.1.0, referencing 0.37.0, rpds-py 2026.6.3, setuptools 65.5.0, six 1.17.0,</w:t>
       </w:r>
       <w:r>
-        <w:t xml:space="preserve"> </w:t>
-      </w:r>
-      <w:proofErr w:type="spellStart"/>
-      <w:r>
-        <w:t>SoundDevice</w:t>
-      </w:r>
-      <w:proofErr w:type="spellEnd"/>
-      <w:r>
-        <w:t xml:space="preserve"> 0.5.5,</w:t>
+        <w:t xml:space="preserve"> SoundDevice 0.5.5,</w:t>
       </w:r>
       <w:r>
-        <w:t xml:space="preserve"> </w:t>
-      </w:r>
-      <w:proofErr w:type="spellStart"/>
-      <w:r>
-        <w:t>soupsieve</w:t>
-      </w:r>
-      <w:proofErr w:type="spellEnd"/>
-      <w:r>
-        <w:t xml:space="preserve"> 2.8.4, tornado 6.5.7, </w:t>
-      </w:r>
-      <w:proofErr w:type="spellStart"/>
-      <w:r>
-        <w:t>traitlets</w:t>
-      </w:r>
-      <w:proofErr w:type="spellEnd"/>
-      <w:r>
-        <w:t xml:space="preserve"> 5.15.1, </w:t>
-      </w:r>
-      <w:proofErr w:type="spellStart"/>
-      <w:r>
-        <w:t>typing_extensions</w:t>
-      </w:r>
-      <w:proofErr w:type="spellEnd"/>
-      <w:r>
-        <w:t xml:space="preserve"> 4.16.0, urllib3 2.7.0, </w:t>
-      </w:r>
-      <w:proofErr w:type="spellStart"/>
-      <w:r>
-        <w:t>wcwidth</w:t>
-      </w:r>
-      <w:proofErr w:type="spellEnd"/>
-      <w:r>
-        <w:t xml:space="preserve"> 0.8.2, </w:t>
-      </w:r>
-      <w:proofErr w:type="spellStart"/>
-      <w:r>
-        <w:t>webencodings</w:t>
-      </w:r>
-      <w:proofErr w:type="spellEnd"/>
-      <w:r>
-        <w:t xml:space="preserve"> 0.5.1, </w:t>
-      </w:r>
-      <w:proofErr w:type="spellStart"/>
-      <w:r>
-        <w:t>yarg</w:t>
-      </w:r>
-      <w:proofErr w:type="spellEnd"/>
-      <w:r>
-        <w:t xml:space="preserve"> 0.1.9.</w:t>
+        <w:t xml:space="preserve"> soupsieve 2.8.4, tornado 6.5.7, traitlets 5.15.1, typing_extensions 4.16.0, urllib3 2.7.0, wcwidth 0.8.2, webencodings 0.5.1, yarg 0.1.9.</w:t>
       </w:r>
     </w:p>
     <w:p>
@@ -867,15 +471,7 @@
               <w:cnfStyle w:val="000000100000" w:firstRow="0" w:lastRow="0" w:firstColumn="0" w:lastColumn="0" w:oddVBand="0" w:evenVBand="0" w:oddHBand="1" w:evenHBand="0" w:firstRowFirstColumn="0" w:firstRowLastColumn="0" w:lastRowFirstColumn="0" w:lastRowLastColumn="0"/>
             </w:pPr>
             <w:r>
-              <w:t xml:space="preserve">Application orchestration and frame loop; </w:t>
-            </w:r>
-            <w:proofErr w:type="gramStart"/>
-            <w:r>
-              <w:t>connects</w:t>
-            </w:r>
-            <w:proofErr w:type="gramEnd"/>
-            <w:r>
-              <w:t xml:space="preserve"> all subsystems.</w:t>
+              <w:t>Application orchestration and frame loop; connects all subsystems.</w:t>
             </w:r>
           </w:p>
         </w:tc>
@@ -934,13 +530,8 @@
             <w:pPr>
               <w:cnfStyle w:val="000000100000" w:firstRow="0" w:lastRow="0" w:firstColumn="0" w:lastColumn="0" w:oddVBand="0" w:evenVBand="0" w:oddHBand="1" w:evenHBand="0" w:firstRowFirstColumn="0" w:firstRowLastColumn="0" w:lastRowFirstColumn="0" w:lastRowLastColumn="0"/>
             </w:pPr>
-            <w:proofErr w:type="gramStart"/>
-            <w:r>
-              <w:t>Selects</w:t>
-            </w:r>
-            <w:proofErr w:type="gramEnd"/>
-            <w:r>
-              <w:t>, initializes, reads, displays, and closes camera/video/depth sources.</w:t>
+            <w:r>
+              <w:t>Selects, initializes, reads, displays, and closes camera/video/depth sources.</w:t>
             </w:r>
           </w:p>
         </w:tc>
@@ -1087,15 +678,7 @@
               <w:cnfStyle w:val="000000000000" w:firstRow="0" w:lastRow="0" w:firstColumn="0" w:lastColumn="0" w:oddVBand="0" w:evenVBand="0" w:oddHBand="0" w:evenHBand="0" w:firstRowFirstColumn="0" w:firstRowLastColumn="0" w:lastRowFirstColumn="0" w:lastRowLastColumn="0"/>
             </w:pPr>
             <w:r>
-              <w:t>Instrument tiles and controls</w:t>
-            </w:r>
-            <w:proofErr w:type="gramStart"/>
-            <w:r>
-              <w:t>; applies</w:t>
-            </w:r>
-            <w:proofErr w:type="gramEnd"/>
-            <w:r>
-              <w:t xml:space="preserve"> selection, grab, movement, release and GUI state.</w:t>
+              <w:t>Instrument tiles and controls; applies selection, grab, movement, release and GUI state.</w:t>
             </w:r>
           </w:p>
         </w:tc>
@@ -1204,28 +787,12 @@
                 <w:lang w:val="de-DE"/>
               </w:rPr>
             </w:pPr>
-            <w:proofErr w:type="spellStart"/>
             <w:r>
               <w:rPr>
                 <w:lang w:val="de-DE"/>
               </w:rPr>
-              <w:t>matlab</w:t>
-            </w:r>
-            <w:proofErr w:type="spellEnd"/>
-            <w:r>
-              <w:rPr>
-                <w:lang w:val="de-DE"/>
-              </w:rPr>
-              <w:t>-code/</w:t>
-            </w:r>
-            <w:proofErr w:type="spellStart"/>
-            <w:r>
-              <w:rPr>
-                <w:lang w:val="de-DE"/>
-              </w:rPr>
-              <w:t>send_udp.m</w:t>
-            </w:r>
-            <w:proofErr w:type="spellEnd"/>
+              <w:t>matlab-code/send_udp.m</w:t>
+            </w:r>
           </w:p>
         </w:tc>
         <w:tc>
@@ -1253,19 +820,9 @@
             <w:tcW w:w="5211" w:type="dxa"/>
           </w:tcPr>
           <w:p>
-            <w:proofErr w:type="spellStart"/>
-            <w:r>
-              <w:t>matlab</w:t>
-            </w:r>
-            <w:proofErr w:type="spellEnd"/>
-            <w:r>
-              <w:t>-code/</w:t>
-            </w:r>
-            <w:proofErr w:type="spellStart"/>
-            <w:r>
-              <w:t>receiv_udp.m</w:t>
-            </w:r>
-            <w:proofErr w:type="spellEnd"/>
+            <w:r>
+              <w:t>matlab-code/receiv_udp.m</w:t>
+            </w:r>
           </w:p>
         </w:tc>
         <w:tc>
@@ -1292,19 +849,9 @@
             <w:tcW w:w="5211" w:type="dxa"/>
           </w:tcPr>
           <w:p>
-            <w:proofErr w:type="spellStart"/>
-            <w:r>
-              <w:t>matlab</w:t>
-            </w:r>
-            <w:proofErr w:type="spellEnd"/>
-            <w:r>
-              <w:t>-code/</w:t>
-            </w:r>
-            <w:proofErr w:type="spellStart"/>
-            <w:r>
-              <w:t>UDP_send_instruments_then_receiv_orders.m</w:t>
-            </w:r>
-            <w:proofErr w:type="spellEnd"/>
+            <w:r>
+              <w:t>matlab-code/UDP_send_instruments_then_receiv_orders.m</w:t>
+            </w:r>
           </w:p>
         </w:tc>
         <w:tc>
@@ -1332,19 +879,9 @@
             <w:tcW w:w="5211" w:type="dxa"/>
           </w:tcPr>
           <w:p>
-            <w:proofErr w:type="spellStart"/>
-            <w:r>
-              <w:t>matlab</w:t>
-            </w:r>
-            <w:proofErr w:type="spellEnd"/>
-            <w:r>
-              <w:t>-code/</w:t>
-            </w:r>
-            <w:proofErr w:type="spellStart"/>
-            <w:r>
-              <w:t>UDP_send_instruments_per_comandline_and_reseiv.m</w:t>
-            </w:r>
-            <w:proofErr w:type="spellEnd"/>
+            <w:r>
+              <w:t>matlab-code/UDP_send_instruments_per_comandline_and_reseiv.m</w:t>
+            </w:r>
           </w:p>
         </w:tc>
         <w:tc>
@@ -1404,23 +941,21 @@
         <w:pStyle w:val="Listennummer"/>
       </w:pPr>
       <w:r>
-        <w:t>Running `python main.py` enters the `if __</w:t>
+        <w:t>Running `python main.py` enters the `if __name__ == '__main__'` block and calls `main()` using values from `settings.py`.</w:t>
       </w:r>
-      <w:proofErr w:type="gramStart"/>
+    </w:p>
+    <w:p>
+      <w:pPr>
+        <w:pStyle w:val="Listennummer"/>
+      </w:pPr>
       <w:r>
-        <w:t>name__</w:t>
+        <w:t>`main()` creates `GuiOverlay`, `</w:t>
       </w:r>
-      <w:proofErr w:type="gramEnd"/>
       <w:r>
-        <w:t xml:space="preserve"> == '__main__'` block and calls `</w:t>
+        <w:t>FrameSource</w:t>
       </w:r>
-      <w:proofErr w:type="gramStart"/>
       <w:r>
-        <w:t>main(</w:t>
-      </w:r>
-      <w:proofErr w:type="gramEnd"/>
-      <w:r>
-        <w:t>)` using values from `settings.py`.</w:t>
+        <w:t>`, two `HandDetector` instances, `PoseDetector`, `RoomAngleDetector`, `GestureDetector`, `SendOnChange`, and `SaveUdpToDict`. The receiver starts in a background thread.</w:t>
       </w:r>
     </w:p>
     <w:p>
@@ -1430,85 +965,11 @@
       <w:r>
         <w:t>`</w:t>
       </w:r>
-      <w:proofErr w:type="gramStart"/>
-      <w:r>
-        <w:t>main(</w:t>
-      </w:r>
-      <w:proofErr w:type="gramEnd"/>
-      <w:r>
-        <w:t>)` creates `</w:t>
-      </w:r>
-      <w:proofErr w:type="spellStart"/>
-      <w:r>
-        <w:t>GuiOverlay</w:t>
-      </w:r>
-      <w:proofErr w:type="spellEnd"/>
-      <w:r>
-        <w:t>`, `</w:t>
-      </w:r>
-      <w:proofErr w:type="spellStart"/>
       <w:r>
         <w:t>FrameSource</w:t>
       </w:r>
-      <w:proofErr w:type="spellEnd"/>
       <w:r>
-        <w:t>`, two `</w:t>
-      </w:r>
-      <w:proofErr w:type="spellStart"/>
-      <w:r>
-        <w:t>HandDetector</w:t>
-      </w:r>
-      <w:proofErr w:type="spellEnd"/>
-      <w:r>
-        <w:t>` instances, `</w:t>
-      </w:r>
-      <w:proofErr w:type="spellStart"/>
-      <w:r>
-        <w:t>PoseDetector</w:t>
-      </w:r>
-      <w:proofErr w:type="spellEnd"/>
-      <w:r>
-        <w:t>`, `</w:t>
-      </w:r>
-      <w:proofErr w:type="spellStart"/>
-      <w:r>
-        <w:t>RoomAngleDetector</w:t>
-      </w:r>
-      <w:proofErr w:type="spellEnd"/>
-      <w:r>
-        <w:t>`, `</w:t>
-      </w:r>
-      <w:proofErr w:type="spellStart"/>
-      <w:r>
-        <w:t>GestureDetector</w:t>
-      </w:r>
-      <w:proofErr w:type="spellEnd"/>
-      <w:r>
-        <w:t>`, `</w:t>
-      </w:r>
-      <w:proofErr w:type="spellStart"/>
-      <w:r>
-        <w:t>SendOnChange</w:t>
-      </w:r>
-      <w:proofErr w:type="spellEnd"/>
-      <w:r>
-        <w:t>`, and `</w:t>
-      </w:r>
-      <w:proofErr w:type="spellStart"/>
-      <w:r>
-        <w:t>SaveUdpToDict</w:t>
-      </w:r>
-      <w:proofErr w:type="spellEnd"/>
-      <w:r>
-        <w:t xml:space="preserve">`. The receiver starts </w:t>
-      </w:r>
-      <w:proofErr w:type="gramStart"/>
-      <w:r>
-        <w:t>in</w:t>
-      </w:r>
-      <w:proofErr w:type="gramEnd"/>
-      <w:r>
-        <w:t xml:space="preserve"> a background thread.</w:t>
+        <w:t>` reads each frame. In RealSense mode it can provide aligned colour and depth frames; in ordinary webcam/video mode only the image is available.</w:t>
       </w:r>
     </w:p>
     <w:p>
@@ -1516,23 +977,7 @@
         <w:pStyle w:val="Listennummer"/>
       </w:pPr>
       <w:r>
-        <w:t>`</w:t>
-      </w:r>
-      <w:proofErr w:type="spellStart"/>
-      <w:r>
-        <w:t>FrameSource</w:t>
-      </w:r>
-      <w:proofErr w:type="spellEnd"/>
-      <w:r>
-        <w:t xml:space="preserve">` reads each frame. In RealSense mode it can provide aligned </w:t>
-      </w:r>
-      <w:proofErr w:type="spellStart"/>
-      <w:r>
-        <w:t>colour</w:t>
-      </w:r>
-      <w:proofErr w:type="spellEnd"/>
-      <w:r>
-        <w:t xml:space="preserve"> and depth frames; in ordinary webcam/video mode only the image is available.</w:t>
+        <w:t>`PoseDetector` estimates body landmarks and exposes shoulder/hand reference points. `HandDetector` estimates hand landmarks. The results are passed to `GestureDetector` and the angle module.</w:t>
       </w:r>
     </w:p>
     <w:p>
@@ -1540,31 +985,7 @@
         <w:pStyle w:val="Listennummer"/>
       </w:pPr>
       <w:r>
-        <w:t>`</w:t>
-      </w:r>
-      <w:proofErr w:type="spellStart"/>
-      <w:r>
-        <w:t>PoseDetector</w:t>
-      </w:r>
-      <w:proofErr w:type="spellEnd"/>
-      <w:r>
-        <w:t>` estimates body landmarks and exposes shoulder/hand reference points. `</w:t>
-      </w:r>
-      <w:proofErr w:type="spellStart"/>
-      <w:r>
-        <w:t>HandDetector</w:t>
-      </w:r>
-      <w:proofErr w:type="spellEnd"/>
-      <w:r>
-        <w:t>` estimates hand landmarks. The results are passed to `</w:t>
-      </w:r>
-      <w:proofErr w:type="spellStart"/>
-      <w:r>
-        <w:t>GestureDetector</w:t>
-      </w:r>
-      <w:proofErr w:type="spellEnd"/>
-      <w:r>
-        <w:t>` and the angle module.</w:t>
+        <w:t>`RoomAngleDetector` estimates pointing azimuth/elevation from hand and shoulder coordinates. With RealSense depth it uses depth/intrinsics; other paths use available MediaPipe world coordinates or fallback approximations.</w:t>
       </w:r>
     </w:p>
     <w:p>
@@ -1572,15 +993,7 @@
         <w:pStyle w:val="Listennummer"/>
       </w:pPr>
       <w:r>
-        <w:t>`</w:t>
-      </w:r>
-      <w:proofErr w:type="spellStart"/>
-      <w:r>
-        <w:t>RoomAngleDetector</w:t>
-      </w:r>
-      <w:proofErr w:type="spellEnd"/>
-      <w:r>
-        <w:t>` estimates pointing azimuth/elevation from hand and shoulder coordinates. With RealSense depth it uses depth/intrinsics; other paths use available MediaPipe world coordinates or fallback approximations.</w:t>
+        <w:t>`GestureDetector` detects hand open/closed states and transitions. A transition from open to closed starts a grab; reopening releases the currently grabbed GUI item. Additional gestures trigger GUI actions.</w:t>
       </w:r>
     </w:p>
     <w:p>
@@ -1588,15 +1001,7 @@
         <w:pStyle w:val="Listennummer"/>
       </w:pPr>
       <w:r>
-        <w:t>`</w:t>
-      </w:r>
-      <w:proofErr w:type="spellStart"/>
-      <w:r>
-        <w:t>GestureDetector</w:t>
-      </w:r>
-      <w:proofErr w:type="spellEnd"/>
-      <w:r>
-        <w:t>` detects hand open/closed states and transitions. A transition from open to closed starts a grab; reopening releases the currently grabbed GUI item. Additional gestures trigger GUI actions.</w:t>
+        <w:t>`GuiOverlay` uses the hand positions and grab/release events to select and move instrument tiles. The selected instrument state is exposed by `get_info()`.</w:t>
       </w:r>
     </w:p>
     <w:p>
@@ -1604,31 +1009,7 @@
         <w:pStyle w:val="Listennummer"/>
       </w:pPr>
       <w:r>
-        <w:t>`</w:t>
-      </w:r>
-      <w:proofErr w:type="spellStart"/>
-      <w:r>
-        <w:t>GuiOverlay</w:t>
-      </w:r>
-      <w:proofErr w:type="spellEnd"/>
-      <w:r>
-        <w:t>` uses the hand positions and grab/release events to select and move instrument tiles. The selected instrument state is exposed by `</w:t>
-      </w:r>
-      <w:proofErr w:type="spellStart"/>
-      <w:r>
-        <w:t>get_</w:t>
-      </w:r>
-      <w:proofErr w:type="gramStart"/>
-      <w:r>
-        <w:t>info</w:t>
-      </w:r>
-      <w:proofErr w:type="spellEnd"/>
-      <w:r>
-        <w:t>(</w:t>
-      </w:r>
-      <w:proofErr w:type="gramEnd"/>
-      <w:r>
-        <w:t>)`.</w:t>
+        <w:t>`SendOnChange` sends a JSON/UDP message when the GUI instrument state changes. Separately, `SaveUdpToDict` receives messages such as `add_instruments` from MATLAB and places them in a queue for `main()` to process.</w:t>
       </w:r>
     </w:p>
     <w:p>
@@ -1636,63 +1017,7 @@
         <w:pStyle w:val="Listennummer"/>
       </w:pPr>
       <w:r>
-        <w:t>`</w:t>
-      </w:r>
-      <w:proofErr w:type="spellStart"/>
-      <w:r>
-        <w:t>SendOnChange</w:t>
-      </w:r>
-      <w:proofErr w:type="spellEnd"/>
-      <w:r>
-        <w:t>` sends a JSON/UDP message when the GUI instrument state changes. Separately, `</w:t>
-      </w:r>
-      <w:proofErr w:type="spellStart"/>
-      <w:r>
-        <w:t>SaveUdpToDict</w:t>
-      </w:r>
-      <w:proofErr w:type="spellEnd"/>
-      <w:r>
-        <w:t>` receives messages such as `</w:t>
-      </w:r>
-      <w:proofErr w:type="spellStart"/>
-      <w:r>
-        <w:t>add_instruments</w:t>
-      </w:r>
-      <w:proofErr w:type="spellEnd"/>
-      <w:r>
-        <w:t xml:space="preserve">` from MATLAB and </w:t>
-      </w:r>
-      <w:proofErr w:type="gramStart"/>
-      <w:r>
-        <w:t>places</w:t>
-      </w:r>
-      <w:proofErr w:type="gramEnd"/>
-      <w:r>
-        <w:t xml:space="preserve"> them in a queue for `</w:t>
-      </w:r>
-      <w:proofErr w:type="gramStart"/>
-      <w:r>
-        <w:t>main(</w:t>
-      </w:r>
-      <w:proofErr w:type="gramEnd"/>
-      <w:r>
-        <w:t>)` to process.</w:t>
-      </w:r>
-    </w:p>
-    <w:p>
-      <w:pPr>
-        <w:pStyle w:val="Listennummer"/>
-      </w:pPr>
-      <w:r>
-        <w:t>On exit, `</w:t>
-      </w:r>
-      <w:proofErr w:type="gramStart"/>
-      <w:r>
-        <w:t>main(</w:t>
-      </w:r>
-      <w:proofErr w:type="gramEnd"/>
-      <w:r>
-        <w:t>)` closes the frame source and prints/saves available analysis statistics.</w:t>
+        <w:t>On exit, `main()` closes the frame source and prints/saves available analysis statistics.</w:t>
       </w:r>
     </w:p>
     <w:p>
@@ -1729,15 +1054,7 @@
           <w:rFonts w:ascii="Consolas" w:hAnsi="Consolas"/>
           <w:sz w:val="16"/>
         </w:rPr>
-        <w:t xml:space="preserve">  ├─ </w:t>
-      </w:r>
-      <w:proofErr w:type="spellStart"/>
-      <w:r>
-        <w:rPr>
-          <w:rFonts w:ascii="Consolas" w:hAnsi="Consolas"/>
-          <w:sz w:val="16"/>
-        </w:rPr>
-        <w:t>frame_handler.</w:t>
+        <w:t xml:space="preserve">  ├─ frame_handler.</w:t>
       </w:r>
       <w:r>
         <w:rPr>
@@ -1746,7 +1063,6 @@
         </w:rPr>
         <w:t>FrameSource</w:t>
       </w:r>
-      <w:proofErr w:type="spellEnd"/>
       <w:r>
         <w:rPr>
           <w:rFonts w:ascii="Consolas" w:hAnsi="Consolas"/>
@@ -1762,39 +1078,7 @@
           <w:rFonts w:ascii="Consolas" w:hAnsi="Consolas"/>
           <w:sz w:val="16"/>
         </w:rPr>
-        <w:t xml:space="preserve">  ├─ </w:t>
-      </w:r>
-      <w:proofErr w:type="spellStart"/>
-      <w:r>
-        <w:rPr>
-          <w:rFonts w:ascii="Consolas" w:hAnsi="Consolas"/>
-          <w:sz w:val="16"/>
-        </w:rPr>
-        <w:t>MediaPipe_handler.PoseDetector</w:t>
-      </w:r>
-      <w:proofErr w:type="spellEnd"/>
-      <w:r>
-        <w:rPr>
-          <w:rFonts w:ascii="Consolas" w:hAnsi="Consolas"/>
-          <w:sz w:val="16"/>
-        </w:rPr>
-        <w:t xml:space="preserve"> + </w:t>
-      </w:r>
-      <w:proofErr w:type="spellStart"/>
-      <w:r>
-        <w:rPr>
-          <w:rFonts w:ascii="Consolas" w:hAnsi="Consolas"/>
-          <w:sz w:val="16"/>
-        </w:rPr>
-        <w:t>HandDetector</w:t>
-      </w:r>
-      <w:proofErr w:type="spellEnd"/>
-      <w:r>
-        <w:rPr>
-          <w:rFonts w:ascii="Consolas" w:hAnsi="Consolas"/>
-          <w:sz w:val="16"/>
-        </w:rPr>
-        <w:t xml:space="preserve"> → landmarks</w:t>
+        <w:t xml:space="preserve">  ├─ MediaPipe_handler.PoseDetector + HandDetector → landmarks</w:t>
       </w:r>
       <w:r>
         <w:br/>
@@ -1804,23 +1088,7 @@
           <w:rFonts w:ascii="Consolas" w:hAnsi="Consolas"/>
           <w:sz w:val="16"/>
         </w:rPr>
-        <w:t xml:space="preserve">  │    └─ </w:t>
-      </w:r>
-      <w:proofErr w:type="spellStart"/>
-      <w:r>
-        <w:rPr>
-          <w:rFonts w:ascii="Consolas" w:hAnsi="Consolas"/>
-          <w:sz w:val="16"/>
-        </w:rPr>
-        <w:t>coordinates_handler</w:t>
-      </w:r>
-      <w:proofErr w:type="spellEnd"/>
-      <w:r>
-        <w:rPr>
-          <w:rFonts w:ascii="Consolas" w:hAnsi="Consolas"/>
-          <w:sz w:val="16"/>
-        </w:rPr>
-        <w:t xml:space="preserve"> → 3D conversion / camera-room compensation</w:t>
+        <w:t xml:space="preserve">  │    └─ coordinates_handler → 3D conversion / camera-room compensation</w:t>
       </w:r>
       <w:r>
         <w:br/>
@@ -1830,23 +1098,7 @@
           <w:rFonts w:ascii="Consolas" w:hAnsi="Consolas"/>
           <w:sz w:val="16"/>
         </w:rPr>
-        <w:t xml:space="preserve">  ├─ </w:t>
-      </w:r>
-      <w:proofErr w:type="spellStart"/>
-      <w:r>
-        <w:rPr>
-          <w:rFonts w:ascii="Consolas" w:hAnsi="Consolas"/>
-          <w:sz w:val="16"/>
-        </w:rPr>
-        <w:t>gesture_handler.GestureDetector</w:t>
-      </w:r>
-      <w:proofErr w:type="spellEnd"/>
-      <w:r>
-        <w:rPr>
-          <w:rFonts w:ascii="Consolas" w:hAnsi="Consolas"/>
-          <w:sz w:val="16"/>
-        </w:rPr>
-        <w:t xml:space="preserve"> → grab/release and control triggers</w:t>
+        <w:t xml:space="preserve">  ├─ gesture_handler.GestureDetector → grab/release and control triggers</w:t>
       </w:r>
       <w:r>
         <w:br/>
@@ -1856,23 +1108,7 @@
           <w:rFonts w:ascii="Consolas" w:hAnsi="Consolas"/>
           <w:sz w:val="16"/>
         </w:rPr>
-        <w:t xml:space="preserve">  ├─ </w:t>
-      </w:r>
-      <w:proofErr w:type="spellStart"/>
-      <w:r>
-        <w:rPr>
-          <w:rFonts w:ascii="Consolas" w:hAnsi="Consolas"/>
-          <w:sz w:val="16"/>
-        </w:rPr>
-        <w:t>angle_handler.RoomAngleDetector</w:t>
-      </w:r>
-      <w:proofErr w:type="spellEnd"/>
-      <w:r>
-        <w:rPr>
-          <w:rFonts w:ascii="Consolas" w:hAnsi="Consolas"/>
-          <w:sz w:val="16"/>
-        </w:rPr>
-        <w:t xml:space="preserve"> → azimuth/elevation in room coordinates</w:t>
+        <w:t xml:space="preserve">  ├─ angle_handler.RoomAngleDetector → azimuth/elevation in room coordinates</w:t>
       </w:r>
       <w:r>
         <w:br/>
@@ -1882,23 +1118,7 @@
           <w:rFonts w:ascii="Consolas" w:hAnsi="Consolas"/>
           <w:sz w:val="16"/>
         </w:rPr>
-        <w:t xml:space="preserve">  ├─ </w:t>
-      </w:r>
-      <w:proofErr w:type="spellStart"/>
-      <w:r>
-        <w:rPr>
-          <w:rFonts w:ascii="Consolas" w:hAnsi="Consolas"/>
-          <w:sz w:val="16"/>
-        </w:rPr>
-        <w:t>GUI.GuiOverlay</w:t>
-      </w:r>
-      <w:proofErr w:type="spellEnd"/>
-      <w:r>
-        <w:rPr>
-          <w:rFonts w:ascii="Consolas" w:hAnsi="Consolas"/>
-          <w:sz w:val="16"/>
-        </w:rPr>
-        <w:t xml:space="preserve"> → instrument selection and movement</w:t>
+        <w:t xml:space="preserve">  ├─ GUI.GuiOverlay → instrument selection and movement</w:t>
       </w:r>
       <w:r>
         <w:br/>
@@ -1910,7 +1130,6 @@
         </w:rPr>
         <w:t xml:space="preserve">  └─ </w:t>
       </w:r>
-      <w:proofErr w:type="spellStart"/>
       <w:r>
         <w:rPr>
           <w:rFonts w:ascii="Consolas" w:hAnsi="Consolas"/>
@@ -1923,31 +1142,7 @@
           <w:rFonts w:ascii="Consolas" w:hAnsi="Consolas"/>
           <w:sz w:val="16"/>
         </w:rPr>
-        <w:t>.SendOnChange</w:t>
-      </w:r>
-      <w:proofErr w:type="spellEnd"/>
-      <w:r>
-        <w:rPr>
-          <w:rFonts w:ascii="Consolas" w:hAnsi="Consolas"/>
-          <w:sz w:val="16"/>
-        </w:rPr>
-        <w:t xml:space="preserve"> / </w:t>
-      </w:r>
-      <w:proofErr w:type="spellStart"/>
-      <w:r>
-        <w:rPr>
-          <w:rFonts w:ascii="Consolas" w:hAnsi="Consolas"/>
-          <w:sz w:val="16"/>
-        </w:rPr>
-        <w:t>SaveUdpToDict</w:t>
-      </w:r>
-      <w:proofErr w:type="spellEnd"/>
-      <w:r>
-        <w:rPr>
-          <w:rFonts w:ascii="Consolas" w:hAnsi="Consolas"/>
-          <w:sz w:val="16"/>
-        </w:rPr>
-        <w:t xml:space="preserve"> ↔ MATLAB audio-system process</w:t>
+        <w:t>.SendOnChange / SaveUdpToDict ↔ MATLAB audio-system process</w:t>
       </w:r>
       <w:r>
         <w:br/>
@@ -2004,7 +1199,13 @@
         <w:pStyle w:val="Listennummer"/>
       </w:pPr>
       <w:r>
-        <w:t>Open PowerShell in the project root (`Stitchi1.0`) and activate the project virtual environment.</w:t>
+        <w:t>Open PowerShell in the project root (`Stitchi</w:t>
+      </w:r>
+      <w:r>
+        <w:t>_</w:t>
+      </w:r>
+      <w:r>
+        <w:t>1`) and activate the project virtual environment.</w:t>
       </w:r>
     </w:p>
     <w:p>
@@ -2033,39 +1234,12 @@
     </w:p>
     <w:p>
       <w:r>
-        <w:t>The current `</w:t>
+        <w:t>For more detailed instructions, see the README.md file in the Stitchy_1 folder.</w:t>
       </w:r>
-      <w:proofErr w:type="spellStart"/>
+    </w:p>
+    <w:p>
       <w:r>
-        <w:t>video_source</w:t>
-      </w:r>
-      <w:proofErr w:type="spellEnd"/>
-      <w:r>
-        <w:t xml:space="preserve"> = 'depth'` setting selects the RealSense depth camera path. For an ordinary webcam, set it to an integer camera index such as `0`. For a video file, set it to the filename/path. RealSense recordings use </w:t>
-      </w:r>
-      <w:proofErr w:type="gramStart"/>
-      <w:r>
-        <w:t>`.bag</w:t>
-      </w:r>
-      <w:proofErr w:type="gramEnd"/>
-      <w:r>
-        <w:t>`; the configured `</w:t>
-      </w:r>
-      <w:proofErr w:type="spellStart"/>
-      <w:r>
-        <w:t>rs_save_type</w:t>
-      </w:r>
-      <w:proofErr w:type="spellEnd"/>
-      <w:r>
-        <w:t xml:space="preserve">` is </w:t>
-      </w:r>
-      <w:proofErr w:type="gramStart"/>
-      <w:r>
-        <w:t>`.bag</w:t>
-      </w:r>
-      <w:proofErr w:type="gramEnd"/>
-      <w:r>
-        <w:t>`.</w:t>
+        <w:t>The current `video_source = 'depth'` setting selects the RealSense depth camera path. For an ordinary webcam, set it to an integer camera index such as `0`. For a video file, set it to the filename/path. RealSense recordings use `.bag`; the configured `rs_save_type` is `.bag`.</w:t>
       </w:r>
     </w:p>
     <w:p>
@@ -2161,15 +1335,7 @@
               <w:cnfStyle w:val="000000100000" w:firstRow="0" w:lastRow="0" w:firstColumn="0" w:lastColumn="0" w:oddVBand="0" w:evenVBand="0" w:oddHBand="1" w:evenHBand="0" w:firstRowFirstColumn="0" w:firstRowLastColumn="0" w:lastRowFirstColumn="0" w:lastRowLastColumn="0"/>
             </w:pPr>
             <w:r>
-              <w:t>`Gesture control` / `</w:t>
-            </w:r>
-            <w:proofErr w:type="spellStart"/>
-            <w:r>
-              <w:t>Stitchi</w:t>
-            </w:r>
-            <w:proofErr w:type="spellEnd"/>
-            <w:r>
-              <w:t xml:space="preserve"> 1.0`</w:t>
+              <w:t>`Gesture control` / `Stitchi 1.0`</w:t>
             </w:r>
           </w:p>
         </w:tc>
@@ -2240,19 +1406,9 @@
             <w:tcW w:w="3250" w:type="dxa"/>
           </w:tcPr>
           <w:p>
-            <w:proofErr w:type="spellStart"/>
-            <w:r>
-              <w:t>start_frame</w:t>
-            </w:r>
-            <w:proofErr w:type="spellEnd"/>
-            <w:r>
-              <w:t xml:space="preserve"> / </w:t>
-            </w:r>
-            <w:proofErr w:type="spellStart"/>
-            <w:r>
-              <w:t>end_frame</w:t>
-            </w:r>
-            <w:proofErr w:type="spellEnd"/>
+            <w:r>
+              <w:t>start_frame / end_frame</w:t>
+            </w:r>
           </w:p>
         </w:tc>
         <w:tc>
@@ -2277,23 +1433,7 @@
               <w:cnfStyle w:val="000000100000" w:firstRow="0" w:lastRow="0" w:firstColumn="0" w:lastColumn="0" w:oddVBand="0" w:evenVBand="0" w:oddHBand="1" w:evenHBand="0" w:firstRowFirstColumn="0" w:firstRowLastColumn="0" w:lastRowFirstColumn="0" w:lastRowLastColumn="0"/>
             </w:pPr>
             <w:r>
-              <w:t xml:space="preserve">Video </w:t>
-            </w:r>
-            <w:proofErr w:type="gramStart"/>
-            <w:r>
-              <w:t>playback</w:t>
-            </w:r>
-            <w:proofErr w:type="gramEnd"/>
-            <w:r>
-              <w:t xml:space="preserve"> start and optional ending frame. `</w:t>
-            </w:r>
-            <w:proofErr w:type="spellStart"/>
-            <w:r>
-              <w:t>end_frame</w:t>
-            </w:r>
-            <w:proofErr w:type="spellEnd"/>
-            <w:r>
-              <w:t xml:space="preserve"> = 0` disables an explicit end limit.</w:t>
+              <w:t>Video playback start and optional ending frame. `end_frame = 0` disables an explicit end limit.</w:t>
             </w:r>
           </w:p>
         </w:tc>
@@ -2308,11 +1448,9 @@
             <w:tcW w:w="3250" w:type="dxa"/>
           </w:tcPr>
           <w:p>
-            <w:proofErr w:type="spellStart"/>
             <w:r>
               <w:t>live_stream_resulutuin</w:t>
             </w:r>
-            <w:proofErr w:type="spellEnd"/>
           </w:p>
         </w:tc>
         <w:tc>
@@ -2337,23 +1475,7 @@
               <w:cnfStyle w:val="000000000000" w:firstRow="0" w:lastRow="0" w:firstColumn="0" w:lastColumn="0" w:oddVBand="0" w:evenVBand="0" w:oddHBand="0" w:evenHBand="0" w:firstRowFirstColumn="0" w:firstRowLastColumn="0" w:lastRowFirstColumn="0" w:lastRowLastColumn="0"/>
             </w:pPr>
             <w:r>
-              <w:t xml:space="preserve">Requested live image dimensions. Higher resolution can improve landmark </w:t>
-            </w:r>
-            <w:proofErr w:type="gramStart"/>
-            <w:r>
-              <w:t>detail</w:t>
-            </w:r>
-            <w:proofErr w:type="gramEnd"/>
-            <w:r>
-              <w:t xml:space="preserve"> but </w:t>
-            </w:r>
-            <w:proofErr w:type="gramStart"/>
-            <w:r>
-              <w:t>increases</w:t>
-            </w:r>
-            <w:proofErr w:type="gramEnd"/>
-            <w:r>
-              <w:t xml:space="preserve"> processing load. Must be supported by the selected camera.</w:t>
+              <w:t>Requested live image dimensions. Higher resolution can improve landmark detail but increases processing load. Must be supported by the selected camera.</w:t>
             </w:r>
           </w:p>
         </w:tc>
@@ -2369,11 +1491,9 @@
             <w:tcW w:w="3250" w:type="dxa"/>
           </w:tcPr>
           <w:p>
-            <w:proofErr w:type="spellStart"/>
             <w:r>
               <w:t>window_size</w:t>
             </w:r>
-            <w:proofErr w:type="spellEnd"/>
           </w:p>
         </w:tc>
         <w:tc>
@@ -2413,19 +1533,9 @@
             <w:tcW w:w="3250" w:type="dxa"/>
           </w:tcPr>
           <w:p>
-            <w:proofErr w:type="spellStart"/>
-            <w:r>
-              <w:t>hand_width_factor</w:t>
-            </w:r>
-            <w:proofErr w:type="spellEnd"/>
-            <w:r>
-              <w:t xml:space="preserve"> / </w:t>
-            </w:r>
-            <w:proofErr w:type="spellStart"/>
-            <w:r>
-              <w:t>hand_opening_factor</w:t>
-            </w:r>
-            <w:proofErr w:type="spellEnd"/>
+            <w:r>
+              <w:t>hand_width_factor / hand_opening_factor</w:t>
+            </w:r>
           </w:p>
         </w:tc>
         <w:tc>
@@ -2466,11 +1576,10 @@
             <w:tcW w:w="3250" w:type="dxa"/>
           </w:tcPr>
           <w:p>
-            <w:proofErr w:type="spellStart"/>
-            <w:r>
+            <w:r>
+              <w:lastRenderedPageBreak/>
               <w:t>skip_frames</w:t>
             </w:r>
-            <w:proofErr w:type="spellEnd"/>
           </w:p>
         </w:tc>
         <w:tc>
@@ -2495,19 +1604,7 @@
               <w:cnfStyle w:val="000000100000" w:firstRow="0" w:lastRow="0" w:firstColumn="0" w:lastColumn="0" w:oddVBand="0" w:evenVBand="0" w:oddHBand="1" w:evenHBand="0" w:firstRowFirstColumn="0" w:firstRowLastColumn="0" w:lastRowFirstColumn="0" w:lastRowLastColumn="0"/>
             </w:pPr>
             <w:r>
-              <w:t xml:space="preserve">Frame skip/analysis-related parameter; verify its call </w:t>
-            </w:r>
-            <w:r>
-              <w:lastRenderedPageBreak/>
-              <w:t xml:space="preserve">sites before relying on it for live recognition because it is not a general </w:t>
-            </w:r>
-            <w:proofErr w:type="gramStart"/>
-            <w:r>
-              <w:t>frame-rate</w:t>
-            </w:r>
-            <w:proofErr w:type="gramEnd"/>
-            <w:r>
-              <w:t xml:space="preserve"> setting.</w:t>
+              <w:t>Frame skip/analysis-related parameter; verify its call sites before relying on it for live recognition because it is not a general frame-rate setting.</w:t>
             </w:r>
           </w:p>
         </w:tc>
@@ -2522,28 +1619,9 @@
             <w:tcW w:w="3250" w:type="dxa"/>
           </w:tcPr>
           <w:p>
-            <w:proofErr w:type="spellStart"/>
-            <w:r>
-              <w:lastRenderedPageBreak/>
-              <w:t>icon_folder</w:t>
-            </w:r>
-            <w:proofErr w:type="spellEnd"/>
-            <w:r>
-              <w:t xml:space="preserve"> / </w:t>
-            </w:r>
-            <w:proofErr w:type="spellStart"/>
-            <w:r>
-              <w:t>screenshots_folder</w:t>
-            </w:r>
-            <w:proofErr w:type="spellEnd"/>
-            <w:r>
-              <w:t xml:space="preserve"> / </w:t>
-            </w:r>
-            <w:proofErr w:type="spellStart"/>
-            <w:r>
-              <w:t>gui_info_window_image_path</w:t>
-            </w:r>
-            <w:proofErr w:type="spellEnd"/>
+            <w:r>
+              <w:t>icon_folder / screenshots_folder / gui_info_window_image_path</w:t>
+            </w:r>
           </w:p>
         </w:tc>
         <w:tc>
@@ -2584,11 +1662,9 @@
             <w:tcW w:w="3250" w:type="dxa"/>
           </w:tcPr>
           <w:p>
-            <w:proofErr w:type="spellStart"/>
             <w:r>
               <w:t>video_folder</w:t>
             </w:r>
-            <w:proofErr w:type="spellEnd"/>
           </w:p>
         </w:tc>
         <w:tc>
@@ -2713,11 +1789,9 @@
             <w:tcW w:w="3250" w:type="dxa"/>
           </w:tcPr>
           <w:p>
-            <w:proofErr w:type="spellStart"/>
             <w:r>
               <w:t>bind_ip</w:t>
             </w:r>
-            <w:proofErr w:type="spellEnd"/>
           </w:p>
         </w:tc>
         <w:tc>
@@ -2758,11 +1832,9 @@
             <w:tcW w:w="3250" w:type="dxa"/>
           </w:tcPr>
           <w:p>
-            <w:proofErr w:type="spellStart"/>
             <w:r>
               <w:t>printout_udp</w:t>
             </w:r>
-            <w:proofErr w:type="spellEnd"/>
           </w:p>
         </w:tc>
         <w:tc>
@@ -2802,19 +1874,9 @@
             <w:tcW w:w="3250" w:type="dxa"/>
           </w:tcPr>
           <w:p>
-            <w:proofErr w:type="spellStart"/>
-            <w:r>
-              <w:t>add_inst_key</w:t>
-            </w:r>
-            <w:proofErr w:type="spellEnd"/>
-            <w:r>
-              <w:t xml:space="preserve"> / </w:t>
-            </w:r>
-            <w:proofErr w:type="spellStart"/>
-            <w:r>
-              <w:t>start_instruments</w:t>
-            </w:r>
-            <w:proofErr w:type="spellEnd"/>
+            <w:r>
+              <w:t>add_inst_key / start_instruments</w:t>
+            </w:r>
           </w:p>
         </w:tc>
         <w:tc>
@@ -2826,15 +1888,7 @@
               <w:cnfStyle w:val="000000000000" w:firstRow="0" w:lastRow="0" w:firstColumn="0" w:lastColumn="0" w:oddVBand="0" w:evenVBand="0" w:oddHBand="0" w:evenHBand="0" w:firstRowFirstColumn="0" w:firstRowLastColumn="0" w:lastRowFirstColumn="0" w:lastRowLastColumn="0"/>
             </w:pPr>
             <w:r>
-              <w:t>`</w:t>
-            </w:r>
-            <w:proofErr w:type="spellStart"/>
-            <w:r>
-              <w:t>add_instruments</w:t>
-            </w:r>
-            <w:proofErr w:type="spellEnd"/>
-            <w:r>
-              <w:t>` / empty list</w:t>
+              <w:t>`add_instruments` / empty list</w:t>
             </w:r>
           </w:p>
         </w:tc>
@@ -2863,11 +1917,9 @@
             <w:tcW w:w="3250" w:type="dxa"/>
           </w:tcPr>
           <w:p>
-            <w:proofErr w:type="spellStart"/>
             <w:r>
               <w:t>video_source</w:t>
             </w:r>
-            <w:proofErr w:type="spellEnd"/>
           </w:p>
         </w:tc>
         <w:tc>
@@ -2892,15 +1944,7 @@
               <w:cnfStyle w:val="000000100000" w:firstRow="0" w:lastRow="0" w:firstColumn="0" w:lastColumn="0" w:oddVBand="0" w:evenVBand="0" w:oddHBand="1" w:evenHBand="0" w:firstRowFirstColumn="0" w:firstRowLastColumn="0" w:lastRowFirstColumn="0" w:lastRowLastColumn="0"/>
             </w:pPr>
             <w:r>
-              <w:t xml:space="preserve">Selects RealSense live depth camera (`depth`), a standard camera index (`0`, `1`, …), an ordinary video file, or a RealSense </w:t>
-            </w:r>
-            <w:proofErr w:type="gramStart"/>
-            <w:r>
-              <w:t>`.bag</w:t>
-            </w:r>
-            <w:proofErr w:type="gramEnd"/>
-            <w:r>
-              <w:t>` recording.</w:t>
+              <w:t>Selects RealSense live depth camera (`depth`), a standard camera index (`0`, `1`, …), an ordinary video file, or a RealSense `.bag` recording.</w:t>
             </w:r>
           </w:p>
         </w:tc>
@@ -2915,11 +1959,9 @@
             <w:tcW w:w="3250" w:type="dxa"/>
           </w:tcPr>
           <w:p>
-            <w:proofErr w:type="spellStart"/>
             <w:r>
               <w:t>default_buffer_mode</w:t>
             </w:r>
-            <w:proofErr w:type="spellEnd"/>
           </w:p>
         </w:tc>
         <w:tc>
@@ -2960,11 +2002,9 @@
             <w:tcW w:w="3250" w:type="dxa"/>
           </w:tcPr>
           <w:p>
-            <w:proofErr w:type="spellStart"/>
             <w:r>
               <w:t>cam_inclination_angle</w:t>
             </w:r>
-            <w:proofErr w:type="spellEnd"/>
           </w:p>
         </w:tc>
         <w:tc>
@@ -3004,11 +2044,9 @@
             <w:tcW w:w="3250" w:type="dxa"/>
           </w:tcPr>
           <w:p>
-            <w:proofErr w:type="spellStart"/>
             <w:r>
               <w:t>visibility_threshold</w:t>
             </w:r>
-            <w:proofErr w:type="spellEnd"/>
           </w:p>
         </w:tc>
         <w:tc>
@@ -3033,15 +2071,7 @@
               <w:cnfStyle w:val="000000000000" w:firstRow="0" w:lastRow="0" w:firstColumn="0" w:lastColumn="0" w:oddVBand="0" w:evenVBand="0" w:oddHBand="0" w:evenHBand="0" w:firstRowFirstColumn="0" w:firstRowLastColumn="0" w:lastRowFirstColumn="0" w:lastRowLastColumn="0"/>
             </w:pPr>
             <w:r>
-              <w:t xml:space="preserve">Minimum landmark visibility </w:t>
-            </w:r>
-            <w:proofErr w:type="gramStart"/>
-            <w:r>
-              <w:t>used</w:t>
-            </w:r>
-            <w:proofErr w:type="gramEnd"/>
-            <w:r>
-              <w:t xml:space="preserve"> by pose/point checks. Higher values reject uncertain points more often; lower values may increase detections but admit noisy landmarks.</w:t>
+              <w:t>Minimum landmark visibility used by pose/point checks. Higher values reject uncertain points more often; lower values may increase detections but admit noisy landmarks.</w:t>
             </w:r>
           </w:p>
         </w:tc>
@@ -3057,11 +2087,9 @@
             <w:tcW w:w="3250" w:type="dxa"/>
           </w:tcPr>
           <w:p>
-            <w:proofErr w:type="spellStart"/>
             <w:r>
               <w:t>align_depth</w:t>
             </w:r>
-            <w:proofErr w:type="spellEnd"/>
           </w:p>
         </w:tc>
         <w:tc>
@@ -3086,15 +2114,7 @@
               <w:cnfStyle w:val="000000100000" w:firstRow="0" w:lastRow="0" w:firstColumn="0" w:lastColumn="0" w:oddVBand="0" w:evenVBand="0" w:oddHBand="1" w:evenHBand="0" w:firstRowFirstColumn="0" w:firstRowLastColumn="0" w:lastRowFirstColumn="0" w:lastRowLastColumn="0"/>
             </w:pPr>
             <w:r>
-              <w:t xml:space="preserve">Aligns RealSense depth to the </w:t>
-            </w:r>
-            <w:proofErr w:type="spellStart"/>
-            <w:r>
-              <w:t>colour</w:t>
-            </w:r>
-            <w:proofErr w:type="spellEnd"/>
-            <w:r>
-              <w:t xml:space="preserve"> stream, so landmark pixels can be sampled from corresponding depth coordinates. Usually needed for this workflow.</w:t>
+              <w:t>Aligns RealSense depth to the colour stream, so landmark pixels can be sampled from corresponding depth coordinates. Usually needed for this workflow.</w:t>
             </w:r>
           </w:p>
         </w:tc>
@@ -3109,11 +2129,9 @@
             <w:tcW w:w="3250" w:type="dxa"/>
           </w:tcPr>
           <w:p>
-            <w:proofErr w:type="spellStart"/>
             <w:r>
               <w:t>active_hand</w:t>
             </w:r>
-            <w:proofErr w:type="spellEnd"/>
           </w:p>
         </w:tc>
         <w:tc>
@@ -3138,15 +2156,7 @@
               <w:cnfStyle w:val="000000000000" w:firstRow="0" w:lastRow="0" w:firstColumn="0" w:lastColumn="0" w:oddVBand="0" w:evenVBand="0" w:oddHBand="0" w:evenHBand="0" w:firstRowFirstColumn="0" w:firstRowLastColumn="0" w:lastRowFirstColumn="0" w:lastRowLastColumn="0"/>
             </w:pPr>
             <w:r>
-              <w:t>Hand selection mode: `right`, `left`, `moving`, `top`, or `</w:t>
-            </w:r>
-            <w:proofErr w:type="gramStart"/>
-            <w:r>
-              <w:t>both`</w:t>
-            </w:r>
-            <w:proofErr w:type="gramEnd"/>
-            <w:r>
-              <w:t>. `moving` chooses based on motion; `top` chooses the highest image hand; `both` processes both hands.</w:t>
+              <w:t>Hand selection mode: `right`, `left`, `moving`, `top`, or `both`. `moving` chooses based on motion; `top` chooses the highest image hand; `both` processes both hands.</w:t>
             </w:r>
           </w:p>
         </w:tc>
@@ -3162,11 +2172,9 @@
             <w:tcW w:w="3250" w:type="dxa"/>
           </w:tcPr>
           <w:p>
-            <w:proofErr w:type="spellStart"/>
             <w:r>
               <w:t>no_hand_frame_count</w:t>
             </w:r>
-            <w:proofErr w:type="spellEnd"/>
           </w:p>
         </w:tc>
         <w:tc>
@@ -3206,11 +2214,9 @@
             <w:tcW w:w="3250" w:type="dxa"/>
           </w:tcPr>
           <w:p>
-            <w:proofErr w:type="spellStart"/>
             <w:r>
               <w:t>moving_min_speed</w:t>
             </w:r>
-            <w:proofErr w:type="spellEnd"/>
           </w:p>
         </w:tc>
         <w:tc>
@@ -3222,15 +2228,7 @@
               <w:cnfStyle w:val="000000000000" w:firstRow="0" w:lastRow="0" w:firstColumn="0" w:lastColumn="0" w:oddVBand="0" w:evenVBand="0" w:oddHBand="0" w:evenHBand="0" w:firstRowFirstColumn="0" w:firstRowLastColumn="0" w:lastRowFirstColumn="0" w:lastRowLastColumn="0"/>
             </w:pPr>
             <w:r>
-              <w:t xml:space="preserve">150 </w:t>
-            </w:r>
-            <w:proofErr w:type="spellStart"/>
-            <w:r>
-              <w:t>px</w:t>
-            </w:r>
-            <w:proofErr w:type="spellEnd"/>
-            <w:r>
-              <w:t>/s</w:t>
+              <w:t>150 px/s</w:t>
             </w:r>
           </w:p>
         </w:tc>
@@ -3243,15 +2241,7 @@
               <w:cnfStyle w:val="000000000000" w:firstRow="0" w:lastRow="0" w:firstColumn="0" w:lastColumn="0" w:oddVBand="0" w:evenVBand="0" w:oddHBand="0" w:evenHBand="0" w:firstRowFirstColumn="0" w:firstRowLastColumn="0" w:lastRowFirstColumn="0" w:lastRowLastColumn="0"/>
             </w:pPr>
             <w:r>
-              <w:t xml:space="preserve">Minimum image-space speed </w:t>
-            </w:r>
-            <w:proofErr w:type="gramStart"/>
-            <w:r>
-              <w:t>used</w:t>
-            </w:r>
-            <w:proofErr w:type="gramEnd"/>
-            <w:r>
-              <w:t xml:space="preserve"> to classify a hand as moving in the moving-hand mode.</w:t>
+              <w:t>Minimum image-space speed used to classify a hand as moving in the moving-hand mode.</w:t>
             </w:r>
           </w:p>
         </w:tc>
@@ -3267,11 +2257,9 @@
             <w:tcW w:w="3250" w:type="dxa"/>
           </w:tcPr>
           <w:p>
-            <w:proofErr w:type="spellStart"/>
             <w:r>
               <w:t>moving_check_time</w:t>
             </w:r>
-            <w:proofErr w:type="spellEnd"/>
           </w:p>
         </w:tc>
         <w:tc>
@@ -3311,11 +2299,9 @@
             <w:tcW w:w="3250" w:type="dxa"/>
           </w:tcPr>
           <w:p>
-            <w:proofErr w:type="spellStart"/>
             <w:r>
               <w:t>hand_change_min_speed</w:t>
             </w:r>
-            <w:proofErr w:type="spellEnd"/>
           </w:p>
         </w:tc>
         <w:tc>
@@ -3327,15 +2313,7 @@
               <w:cnfStyle w:val="000000000000" w:firstRow="0" w:lastRow="0" w:firstColumn="0" w:lastColumn="0" w:oddVBand="0" w:evenVBand="0" w:oddHBand="0" w:evenHBand="0" w:firstRowFirstColumn="0" w:firstRowLastColumn="0" w:lastRowFirstColumn="0" w:lastRowLastColumn="0"/>
             </w:pPr>
             <w:r>
-              <w:t xml:space="preserve">200 </w:t>
-            </w:r>
-            <w:proofErr w:type="spellStart"/>
-            <w:r>
-              <w:t>px</w:t>
-            </w:r>
-            <w:proofErr w:type="spellEnd"/>
-            <w:r>
-              <w:t>/s</w:t>
+              <w:t>200 px/s</w:t>
             </w:r>
           </w:p>
         </w:tc>
@@ -3364,11 +2342,9 @@
             <w:tcW w:w="3250" w:type="dxa"/>
           </w:tcPr>
           <w:p>
-            <w:proofErr w:type="spellStart"/>
             <w:r>
               <w:t>use_roi</w:t>
             </w:r>
-            <w:proofErr w:type="spellEnd"/>
           </w:p>
         </w:tc>
         <w:tc>
@@ -3393,19 +2369,11 @@
               <w:cnfStyle w:val="000000100000" w:firstRow="0" w:lastRow="0" w:firstColumn="0" w:lastColumn="0" w:oddVBand="0" w:evenVBand="0" w:oddHBand="1" w:evenHBand="0" w:firstRowFirstColumn="0" w:firstRowLastColumn="0" w:lastRowFirstColumn="0" w:lastRowLastColumn="0"/>
             </w:pPr>
             <w:r>
-              <w:t xml:space="preserve">Restricts hand detection to a region around the expected hand. Can improve speed/detection in the </w:t>
+              <w:t xml:space="preserve">Restricts hand detection to a region around the </w:t>
             </w:r>
             <w:r>
               <w:lastRenderedPageBreak/>
-              <w:t xml:space="preserve">intended </w:t>
-            </w:r>
-            <w:proofErr w:type="gramStart"/>
-            <w:r>
-              <w:t>region, but</w:t>
-            </w:r>
-            <w:proofErr w:type="gramEnd"/>
-            <w:r>
-              <w:t xml:space="preserve"> may miss a hand outside the ROI.</w:t>
+              <w:t>expected hand. Can improve speed/detection in the intended region, but may miss a hand outside the ROI.</w:t>
             </w:r>
           </w:p>
         </w:tc>
@@ -3420,12 +2388,10 @@
             <w:tcW w:w="3250" w:type="dxa"/>
           </w:tcPr>
           <w:p>
-            <w:proofErr w:type="spellStart"/>
             <w:r>
               <w:lastRenderedPageBreak/>
               <w:t>roi_min_size</w:t>
             </w:r>
-            <w:proofErr w:type="spellEnd"/>
           </w:p>
         </w:tc>
         <w:tc>
@@ -3437,13 +2403,8 @@
               <w:cnfStyle w:val="000000000000" w:firstRow="0" w:lastRow="0" w:firstColumn="0" w:lastColumn="0" w:oddVBand="0" w:evenVBand="0" w:oddHBand="0" w:evenHBand="0" w:firstRowFirstColumn="0" w:firstRowLastColumn="0" w:lastRowFirstColumn="0" w:lastRowLastColumn="0"/>
             </w:pPr>
             <w:r>
-              <w:t xml:space="preserve">50 </w:t>
-            </w:r>
-            <w:proofErr w:type="spellStart"/>
-            <w:r>
-              <w:t>px</w:t>
-            </w:r>
-            <w:proofErr w:type="spellEnd"/>
+              <w:t>50 px</w:t>
+            </w:r>
           </w:p>
         </w:tc>
         <w:tc>
@@ -3471,11 +2432,9 @@
             <w:tcW w:w="3250" w:type="dxa"/>
           </w:tcPr>
           <w:p>
-            <w:proofErr w:type="spellStart"/>
             <w:r>
               <w:t>hand_shoulder_intersect_dist</w:t>
             </w:r>
-            <w:proofErr w:type="spellEnd"/>
           </w:p>
         </w:tc>
         <w:tc>
@@ -3515,11 +2474,9 @@
             <w:tcW w:w="3250" w:type="dxa"/>
           </w:tcPr>
           <w:p>
-            <w:proofErr w:type="spellStart"/>
             <w:r>
               <w:t>hand_shoulder_intersect_pixel</w:t>
             </w:r>
-            <w:proofErr w:type="spellEnd"/>
           </w:p>
         </w:tc>
         <w:tc>
@@ -3531,13 +2488,8 @@
               <w:cnfStyle w:val="000000000000" w:firstRow="0" w:lastRow="0" w:firstColumn="0" w:lastColumn="0" w:oddVBand="0" w:evenVBand="0" w:oddHBand="0" w:evenHBand="0" w:firstRowFirstColumn="0" w:firstRowLastColumn="0" w:lastRowFirstColumn="0" w:lastRowLastColumn="0"/>
             </w:pPr>
             <w:r>
-              <w:t xml:space="preserve">20 </w:t>
-            </w:r>
-            <w:proofErr w:type="spellStart"/>
-            <w:r>
-              <w:t>px</w:t>
-            </w:r>
-            <w:proofErr w:type="spellEnd"/>
+              <w:t>20 px</w:t>
+            </w:r>
           </w:p>
         </w:tc>
         <w:tc>
@@ -3549,15 +2501,7 @@
               <w:cnfStyle w:val="000000000000" w:firstRow="0" w:lastRow="0" w:firstColumn="0" w:lastColumn="0" w:oddVBand="0" w:evenVBand="0" w:oddHBand="0" w:evenHBand="0" w:firstRowFirstColumn="0" w:firstRowLastColumn="0" w:lastRowFirstColumn="0" w:lastRowLastColumn="0"/>
             </w:pPr>
             <w:r>
-              <w:t xml:space="preserve">Image-space threshold for the same special case when depth-based distance is unavailable. Despite the source comment, the unit is pixels, not </w:t>
-            </w:r>
-            <w:proofErr w:type="spellStart"/>
-            <w:r>
-              <w:t>metres</w:t>
-            </w:r>
-            <w:proofErr w:type="spellEnd"/>
-            <w:r>
-              <w:t>.</w:t>
+              <w:t>Image-space threshold for the same special case when depth-based distance is unavailable. Despite the source comment, the unit is pixels, not metres.</w:t>
             </w:r>
           </w:p>
         </w:tc>
@@ -3573,11 +2517,9 @@
             <w:tcW w:w="3250" w:type="dxa"/>
           </w:tcPr>
           <w:p>
-            <w:proofErr w:type="spellStart"/>
             <w:r>
               <w:t>hand_center_hands</w:t>
             </w:r>
-            <w:proofErr w:type="spellEnd"/>
           </w:p>
         </w:tc>
         <w:tc>
@@ -3602,15 +2544,7 @@
               <w:cnfStyle w:val="000000100000" w:firstRow="0" w:lastRow="0" w:firstColumn="0" w:lastColumn="0" w:oddVBand="0" w:evenVBand="0" w:oddHBand="1" w:evenHBand="0" w:firstRowFirstColumn="0" w:firstRowLastColumn="0" w:lastRowFirstColumn="0" w:lastRowLastColumn="0"/>
             </w:pPr>
             <w:r>
-              <w:t xml:space="preserve">MediaPipe Hands landmark indices used to estimate hand </w:t>
-            </w:r>
-            <w:proofErr w:type="spellStart"/>
-            <w:r>
-              <w:t>centre</w:t>
-            </w:r>
-            <w:proofErr w:type="spellEnd"/>
-            <w:r>
-              <w:t>. Changing indices changes the point used for cursor/pointing calculations.</w:t>
+              <w:t>MediaPipe Hands landmark indices used to estimate hand centre. Changing indices changes the point used for cursor/pointing calculations.</w:t>
             </w:r>
           </w:p>
         </w:tc>
@@ -3625,19 +2559,9 @@
             <w:tcW w:w="3250" w:type="dxa"/>
           </w:tcPr>
           <w:p>
-            <w:proofErr w:type="spellStart"/>
-            <w:r>
-              <w:t>left_hand_center_pose</w:t>
-            </w:r>
-            <w:proofErr w:type="spellEnd"/>
-            <w:r>
-              <w:t xml:space="preserve"> / </w:t>
-            </w:r>
-            <w:proofErr w:type="spellStart"/>
-            <w:r>
-              <w:t>right_hand_center_pose</w:t>
-            </w:r>
-            <w:proofErr w:type="spellEnd"/>
+            <w:r>
+              <w:t>left_hand_center_pose / right_hand_center_pose</w:t>
+            </w:r>
           </w:p>
         </w:tc>
         <w:tc>
@@ -3662,15 +2586,7 @@
               <w:cnfStyle w:val="000000000000" w:firstRow="0" w:lastRow="0" w:firstColumn="0" w:lastColumn="0" w:oddVBand="0" w:evenVBand="0" w:oddHBand="0" w:evenHBand="0" w:firstRowFirstColumn="0" w:firstRowLastColumn="0" w:lastRowFirstColumn="0" w:lastRowLastColumn="0"/>
             </w:pPr>
             <w:r>
-              <w:t>MediaPipe Pose landmark pairs used as hand-</w:t>
-            </w:r>
-            <w:proofErr w:type="spellStart"/>
-            <w:r>
-              <w:t>centre</w:t>
-            </w:r>
-            <w:proofErr w:type="spellEnd"/>
-            <w:r>
-              <w:t xml:space="preserve"> approximations when using pose landmarks.</w:t>
+              <w:t>MediaPipe Pose landmark pairs used as hand-centre approximations when using pose landmarks.</w:t>
             </w:r>
           </w:p>
         </w:tc>
@@ -3686,11 +2602,9 @@
             <w:tcW w:w="3250" w:type="dxa"/>
           </w:tcPr>
           <w:p>
-            <w:proofErr w:type="spellStart"/>
             <w:r>
               <w:t>grab_detection_methode</w:t>
             </w:r>
-            <w:proofErr w:type="spellEnd"/>
           </w:p>
         </w:tc>
         <w:tc>
@@ -3730,11 +2644,9 @@
             <w:tcW w:w="3250" w:type="dxa"/>
           </w:tcPr>
           <w:p>
-            <w:proofErr w:type="spellStart"/>
             <w:r>
               <w:t>dynamic_grab_distance_difference</w:t>
             </w:r>
-            <w:proofErr w:type="spellEnd"/>
           </w:p>
         </w:tc>
         <w:tc>
@@ -3781,11 +2693,9 @@
             <w:tcW w:w="3250" w:type="dxa"/>
           </w:tcPr>
           <w:p>
-            <w:proofErr w:type="spellStart"/>
             <w:r>
               <w:t>dynamic_grab_time_difference</w:t>
             </w:r>
-            <w:proofErr w:type="spellEnd"/>
           </w:p>
         </w:tc>
         <w:tc>
@@ -3828,19 +2738,9 @@
             <w:tcW w:w="3250" w:type="dxa"/>
           </w:tcPr>
           <w:p>
-            <w:proofErr w:type="spellStart"/>
-            <w:r>
-              <w:t>hand_status_buffer_size</w:t>
-            </w:r>
-            <w:proofErr w:type="spellEnd"/>
-            <w:r>
-              <w:t xml:space="preserve"> / </w:t>
-            </w:r>
-            <w:proofErr w:type="spellStart"/>
-            <w:r>
-              <w:t>hand_status_buffer_atleast</w:t>
-            </w:r>
-            <w:proofErr w:type="spellEnd"/>
+            <w:r>
+              <w:t>hand_status_buffer_size / hand_status_buffer_atleast</w:t>
+            </w:r>
           </w:p>
         </w:tc>
         <w:tc>
@@ -3896,21 +2796,17 @@
             <w:tcW w:w="3250" w:type="dxa"/>
           </w:tcPr>
           <w:p>
-            <w:proofErr w:type="spellStart"/>
             <w:r>
               <w:t>hand_open_thrashold</w:t>
             </w:r>
-            <w:proofErr w:type="spellEnd"/>
             <w:r>
               <w:t xml:space="preserve"> /</w:t>
             </w:r>
           </w:p>
           <w:p>
-            <w:proofErr w:type="spellStart"/>
             <w:r>
               <w:t>hand_close_thrashold</w:t>
             </w:r>
-            <w:proofErr w:type="spellEnd"/>
           </w:p>
           <w:p/>
         </w:tc>
@@ -3969,11 +2865,9 @@
             <w:tcW w:w="3250" w:type="dxa"/>
           </w:tcPr>
           <w:p>
-            <w:proofErr w:type="spellStart"/>
             <w:r>
               <w:t>angle_buffer_size</w:t>
             </w:r>
-            <w:proofErr w:type="spellEnd"/>
           </w:p>
         </w:tc>
         <w:tc>
@@ -4014,11 +2908,9 @@
             <w:tcW w:w="3250" w:type="dxa"/>
           </w:tcPr>
           <w:p>
-            <w:proofErr w:type="spellStart"/>
             <w:r>
               <w:t>volume_decimal_place</w:t>
             </w:r>
-            <w:proofErr w:type="spellEnd"/>
           </w:p>
         </w:tc>
         <w:tc>
@@ -4058,11 +2950,9 @@
             <w:tcW w:w="3250" w:type="dxa"/>
           </w:tcPr>
           <w:p>
-            <w:proofErr w:type="spellStart"/>
             <w:r>
               <w:t>real_depth_angle_resulutuin</w:t>
             </w:r>
-            <w:proofErr w:type="spellEnd"/>
           </w:p>
         </w:tc>
         <w:tc>
@@ -4087,15 +2977,7 @@
               <w:cnfStyle w:val="000000000000" w:firstRow="0" w:lastRow="0" w:firstColumn="0" w:lastColumn="0" w:oddVBand="0" w:evenVBand="0" w:oddHBand="0" w:evenHBand="0" w:firstRowFirstColumn="0" w:firstRowLastColumn="0" w:lastRowFirstColumn="0" w:lastRowLastColumn="0"/>
             </w:pPr>
             <w:r>
-              <w:t xml:space="preserve">Quantization step/resolution for room pointing angles when depth is used. Coarser steps reduce </w:t>
-            </w:r>
-            <w:proofErr w:type="gramStart"/>
-            <w:r>
-              <w:t>jitter</w:t>
-            </w:r>
-            <w:proofErr w:type="gramEnd"/>
-            <w:r>
-              <w:t xml:space="preserve"> but reduce directional precision.</w:t>
+              <w:t>Quantization step/resolution for room pointing angles when depth is used. Coarser steps reduce jitter but reduce directional precision.</w:t>
             </w:r>
           </w:p>
         </w:tc>
@@ -4111,11 +2993,9 @@
             <w:tcW w:w="3250" w:type="dxa"/>
           </w:tcPr>
           <w:p>
-            <w:proofErr w:type="spellStart"/>
             <w:r>
               <w:t>ray_tracing_step_size</w:t>
             </w:r>
-            <w:proofErr w:type="spellEnd"/>
           </w:p>
         </w:tc>
         <w:tc>
@@ -4155,11 +3035,9 @@
             <w:tcW w:w="3250" w:type="dxa"/>
           </w:tcPr>
           <w:p>
-            <w:proofErr w:type="spellStart"/>
             <w:r>
               <w:t>room_size</w:t>
             </w:r>
-            <w:proofErr w:type="spellEnd"/>
           </w:p>
         </w:tc>
         <w:tc>
@@ -4184,15 +3062,7 @@
               <w:cnfStyle w:val="000000000000" w:firstRow="0" w:lastRow="0" w:firstColumn="0" w:lastColumn="0" w:oddVBand="0" w:evenVBand="0" w:oddHBand="0" w:evenHBand="0" w:firstRowFirstColumn="0" w:firstRowLastColumn="0" w:lastRowFirstColumn="0" w:lastRowLastColumn="0"/>
             </w:pPr>
             <w:r>
-              <w:t xml:space="preserve">Room dimensions in x/y/z </w:t>
-            </w:r>
-            <w:proofErr w:type="gramStart"/>
-            <w:r>
-              <w:t>used</w:t>
-            </w:r>
-            <w:proofErr w:type="gramEnd"/>
-            <w:r>
-              <w:t xml:space="preserve"> for ray tracing. Must match the coordinate convention and modeled room.</w:t>
+              <w:t>Room dimensions in x/y/z used for ray tracing. Must match the coordinate convention and modeled room.</w:t>
             </w:r>
           </w:p>
         </w:tc>
@@ -4208,11 +3078,9 @@
             <w:tcW w:w="3250" w:type="dxa"/>
           </w:tcPr>
           <w:p>
-            <w:proofErr w:type="spellStart"/>
             <w:r>
               <w:t>room_center</w:t>
             </w:r>
-            <w:proofErr w:type="spellEnd"/>
           </w:p>
         </w:tc>
         <w:tc>
@@ -4237,15 +3105,11 @@
               <w:cnfStyle w:val="000000100000" w:firstRow="0" w:lastRow="0" w:firstColumn="0" w:lastColumn="0" w:oddVBand="0" w:evenVBand="0" w:oddHBand="1" w:evenHBand="0" w:firstRowFirstColumn="0" w:firstRowLastColumn="0" w:lastRowFirstColumn="0" w:lastRowLastColumn="0"/>
             </w:pPr>
             <w:r>
-              <w:t xml:space="preserve">Reference </w:t>
-            </w:r>
-            <w:proofErr w:type="spellStart"/>
-            <w:r>
-              <w:t>centre</w:t>
-            </w:r>
-            <w:proofErr w:type="spellEnd"/>
-            <w:r>
-              <w:t xml:space="preserve"> of the room used for room-relative direction calculations.</w:t>
+              <w:t xml:space="preserve">Reference centre of the room used for room-relative </w:t>
+            </w:r>
+            <w:r>
+              <w:lastRenderedPageBreak/>
+              <w:t>direction calculations.</w:t>
             </w:r>
           </w:p>
         </w:tc>
@@ -4260,12 +3124,10 @@
             <w:tcW w:w="3250" w:type="dxa"/>
           </w:tcPr>
           <w:p>
-            <w:proofErr w:type="spellStart"/>
             <w:r>
               <w:lastRenderedPageBreak/>
               <w:t>cam_pos_in_room</w:t>
             </w:r>
-            <w:proofErr w:type="spellEnd"/>
           </w:p>
         </w:tc>
         <w:tc>
@@ -4306,11 +3168,9 @@
             <w:tcW w:w="3250" w:type="dxa"/>
           </w:tcPr>
           <w:p>
-            <w:proofErr w:type="spellStart"/>
             <w:r>
               <w:t>estimated_hip_hight</w:t>
             </w:r>
-            <w:proofErr w:type="spellEnd"/>
           </w:p>
         </w:tc>
         <w:tc>
@@ -4350,11 +3210,9 @@
             <w:tcW w:w="3250" w:type="dxa"/>
           </w:tcPr>
           <w:p>
-            <w:proofErr w:type="spellStart"/>
             <w:r>
               <w:t>show_gui</w:t>
             </w:r>
-            <w:proofErr w:type="spellEnd"/>
           </w:p>
         </w:tc>
         <w:tc>
@@ -4395,11 +3253,9 @@
             <w:tcW w:w="3250" w:type="dxa"/>
           </w:tcPr>
           <w:p>
-            <w:proofErr w:type="spellStart"/>
             <w:r>
               <w:t>gui_tile_max_size</w:t>
             </w:r>
-            <w:proofErr w:type="spellEnd"/>
           </w:p>
         </w:tc>
         <w:tc>
@@ -4411,13 +3267,8 @@
               <w:cnfStyle w:val="000000100000" w:firstRow="0" w:lastRow="0" w:firstColumn="0" w:lastColumn="0" w:oddVBand="0" w:evenVBand="0" w:oddHBand="1" w:evenHBand="0" w:firstRowFirstColumn="0" w:firstRowLastColumn="0" w:lastRowFirstColumn="0" w:lastRowLastColumn="0"/>
             </w:pPr>
             <w:r>
-              <w:t xml:space="preserve">100 </w:t>
-            </w:r>
-            <w:proofErr w:type="spellStart"/>
-            <w:r>
-              <w:t>px</w:t>
-            </w:r>
-            <w:proofErr w:type="spellEnd"/>
+              <w:t>100 px</w:t>
+            </w:r>
           </w:p>
         </w:tc>
         <w:tc>
@@ -4444,11 +3295,9 @@
             <w:tcW w:w="3250" w:type="dxa"/>
           </w:tcPr>
           <w:p>
-            <w:proofErr w:type="spellStart"/>
             <w:r>
               <w:t>gui_hight</w:t>
             </w:r>
-            <w:proofErr w:type="spellEnd"/>
           </w:p>
         </w:tc>
         <w:tc>
@@ -4489,11 +3338,9 @@
             <w:tcW w:w="3250" w:type="dxa"/>
           </w:tcPr>
           <w:p>
-            <w:proofErr w:type="spellStart"/>
             <w:r>
               <w:t>controll_trigger_text_time</w:t>
             </w:r>
-            <w:proofErr w:type="spellEnd"/>
           </w:p>
         </w:tc>
         <w:tc>
@@ -4533,11 +3380,9 @@
             <w:tcW w:w="3250" w:type="dxa"/>
           </w:tcPr>
           <w:p>
-            <w:proofErr w:type="spellStart"/>
             <w:r>
               <w:t>instrument_start_volume</w:t>
             </w:r>
-            <w:proofErr w:type="spellEnd"/>
           </w:p>
         </w:tc>
         <w:tc>
@@ -4578,11 +3423,9 @@
             <w:tcW w:w="3250" w:type="dxa"/>
           </w:tcPr>
           <w:p>
-            <w:proofErr w:type="spellStart"/>
             <w:r>
               <w:t>no_mouse_control</w:t>
             </w:r>
-            <w:proofErr w:type="spellEnd"/>
           </w:p>
         </w:tc>
         <w:tc>
@@ -4622,11 +3465,9 @@
             <w:tcW w:w="3250" w:type="dxa"/>
           </w:tcPr>
           <w:p>
-            <w:proofErr w:type="spellStart"/>
             <w:r>
               <w:t>mirrow_view</w:t>
             </w:r>
-            <w:proofErr w:type="spellEnd"/>
           </w:p>
         </w:tc>
         <w:tc>
@@ -4667,43 +3508,9 @@
             <w:tcW w:w="3250" w:type="dxa"/>
           </w:tcPr>
           <w:p>
-            <w:proofErr w:type="spellStart"/>
-            <w:r>
-              <w:t>draw_aperture</w:t>
-            </w:r>
-            <w:proofErr w:type="spellEnd"/>
-            <w:r>
-              <w:t xml:space="preserve"> / </w:t>
-            </w:r>
-            <w:proofErr w:type="spellStart"/>
-            <w:r>
-              <w:t>draw_hand_skeleton</w:t>
-            </w:r>
-            <w:proofErr w:type="spellEnd"/>
-            <w:r>
-              <w:t xml:space="preserve"> / </w:t>
-            </w:r>
-            <w:proofErr w:type="spellStart"/>
-            <w:r>
-              <w:t>draw_body_skeleton</w:t>
-            </w:r>
-            <w:proofErr w:type="spellEnd"/>
-            <w:r>
-              <w:t xml:space="preserve"> / </w:t>
-            </w:r>
-            <w:proofErr w:type="spellStart"/>
-            <w:r>
-              <w:t>draw_roi</w:t>
-            </w:r>
-            <w:proofErr w:type="spellEnd"/>
-            <w:r>
-              <w:t xml:space="preserve"> / </w:t>
-            </w:r>
-            <w:proofErr w:type="spellStart"/>
-            <w:r>
-              <w:t>draw_hand_vlidation_dist</w:t>
-            </w:r>
-            <w:proofErr w:type="spellEnd"/>
+            <w:r>
+              <w:t>draw_aperture / draw_hand_skeleton / draw_body_skeleton / draw_roi / draw_hand_vlidation_dist</w:t>
+            </w:r>
           </w:p>
         </w:tc>
         <w:tc>
@@ -4743,11 +3550,9 @@
             <w:tcW w:w="3250" w:type="dxa"/>
           </w:tcPr>
           <w:p>
-            <w:proofErr w:type="spellStart"/>
             <w:r>
               <w:t>show_depth_frame</w:t>
             </w:r>
-            <w:proofErr w:type="spellEnd"/>
           </w:p>
         </w:tc>
         <w:tc>
@@ -4788,11 +3593,9 @@
             <w:tcW w:w="3250" w:type="dxa"/>
           </w:tcPr>
           <w:p>
-            <w:proofErr w:type="spellStart"/>
             <w:r>
               <w:t>type_instrument</w:t>
             </w:r>
-            <w:proofErr w:type="spellEnd"/>
           </w:p>
         </w:tc>
         <w:tc>
@@ -4832,11 +3635,9 @@
             <w:tcW w:w="3250" w:type="dxa"/>
           </w:tcPr>
           <w:p>
-            <w:proofErr w:type="spellStart"/>
             <w:r>
               <w:t>rs_save_type</w:t>
             </w:r>
-            <w:proofErr w:type="spellEnd"/>
           </w:p>
         </w:tc>
         <w:tc>
@@ -4847,13 +3648,8 @@
             <w:pPr>
               <w:cnfStyle w:val="000000000000" w:firstRow="0" w:lastRow="0" w:firstColumn="0" w:lastColumn="0" w:oddVBand="0" w:evenVBand="0" w:oddHBand="0" w:evenHBand="0" w:firstRowFirstColumn="0" w:firstRowLastColumn="0" w:lastRowFirstColumn="0" w:lastRowLastColumn="0"/>
             </w:pPr>
-            <w:proofErr w:type="gramStart"/>
-            <w:r>
-              <w:t>`.bag</w:t>
-            </w:r>
-            <w:proofErr w:type="gramEnd"/>
-            <w:r>
-              <w:t>`</w:t>
+            <w:r>
+              <w:t>`.bag`</w:t>
             </w:r>
           </w:p>
         </w:tc>
@@ -4882,11 +3678,9 @@
             <w:tcW w:w="3250" w:type="dxa"/>
           </w:tcPr>
           <w:p>
-            <w:proofErr w:type="spellStart"/>
             <w:r>
               <w:t>display_feedback_mode</w:t>
             </w:r>
-            <w:proofErr w:type="spellEnd"/>
           </w:p>
         </w:tc>
         <w:tc>
@@ -4897,21 +3691,8 @@
             <w:pPr>
               <w:cnfStyle w:val="000000100000" w:firstRow="0" w:lastRow="0" w:firstColumn="0" w:lastColumn="0" w:oddVBand="0" w:evenVBand="0" w:oddHBand="1" w:evenHBand="0" w:firstRowFirstColumn="0" w:firstRowLastColumn="0" w:lastRowFirstColumn="0" w:lastRowLastColumn="0"/>
             </w:pPr>
-            <w:proofErr w:type="gramStart"/>
-            <w:r>
-              <w:t>two</w:t>
-            </w:r>
-            <w:proofErr w:type="gramEnd"/>
-            <w:r>
-              <w:t xml:space="preserve"> modes: </w:t>
-            </w:r>
-            <w:proofErr w:type="spellStart"/>
-            <w:r>
-              <w:t>processing+GUI</w:t>
-            </w:r>
-            <w:proofErr w:type="spellEnd"/>
-            <w:r>
-              <w:t>; GUI only</w:t>
+            <w:r>
+              <w:t>two modes: processing+GUI; GUI only</w:t>
             </w:r>
           </w:p>
         </w:tc>
@@ -4953,15 +3734,7 @@
               <w:cnfStyle w:val="000000000000" w:firstRow="0" w:lastRow="0" w:firstColumn="0" w:lastColumn="0" w:oddVBand="0" w:evenVBand="0" w:oddHBand="0" w:evenHBand="0" w:firstRowFirstColumn="0" w:firstRowLastColumn="0" w:lastRowFirstColumn="0" w:lastRowLastColumn="0"/>
             </w:pPr>
             <w:r>
-              <w:t xml:space="preserve">BGR </w:t>
-            </w:r>
-            <w:proofErr w:type="spellStart"/>
-            <w:r>
-              <w:t>colour</w:t>
-            </w:r>
-            <w:proofErr w:type="spellEnd"/>
-            <w:r>
-              <w:t xml:space="preserve"> tuples</w:t>
+              <w:t>BGR colour tuples</w:t>
             </w:r>
           </w:p>
         </w:tc>
@@ -4973,13 +3746,8 @@
             <w:pPr>
               <w:cnfStyle w:val="000000000000" w:firstRow="0" w:lastRow="0" w:firstColumn="0" w:lastColumn="0" w:oddVBand="0" w:evenVBand="0" w:oddHBand="0" w:evenHBand="0" w:firstRowFirstColumn="0" w:firstRowLastColumn="0" w:lastRowFirstColumn="0" w:lastRowLastColumn="0"/>
             </w:pPr>
-            <w:proofErr w:type="spellStart"/>
-            <w:r>
-              <w:t>Colours</w:t>
-            </w:r>
-            <w:proofErr w:type="spellEnd"/>
-            <w:r>
-              <w:t xml:space="preserve"> for overlays and GUI feedback; OpenCV uses BGR ordering.</w:t>
+            <w:r>
+              <w:t>Colours for overlays and GUI feedback; OpenCV uses BGR ordering.</w:t>
             </w:r>
           </w:p>
         </w:tc>
@@ -5001,11 +3769,9 @@
       <w:r>
         <w:t>‘</w:t>
       </w:r>
-      <w:proofErr w:type="spellStart"/>
       <w:r>
         <w:t>grab_detection_methode</w:t>
       </w:r>
-      <w:proofErr w:type="spellEnd"/>
       <w:r>
         <w:t xml:space="preserve">’ </w:t>
       </w:r>
@@ -5013,23 +3779,7 @@
         <w:t xml:space="preserve">to set the static or dynamic hand-detection method. If you wish to modify the dynamic hand-detection method, focus on parameters </w:t>
       </w:r>
       <w:r>
-        <w:t>‘</w:t>
-      </w:r>
-      <w:proofErr w:type="spellStart"/>
-      <w:r>
-        <w:t>dynamic_grab_distance_difference</w:t>
-      </w:r>
-      <w:proofErr w:type="spellEnd"/>
-      <w:r>
-        <w:t>’ and ‘</w:t>
-      </w:r>
-      <w:proofErr w:type="spellStart"/>
-      <w:r>
-        <w:t>dynamic_grab_time_difference</w:t>
-      </w:r>
-      <w:proofErr w:type="spellEnd"/>
-      <w:r>
-        <w:t>’.</w:t>
+        <w:t>‘dynamic_grab_distance_difference’ and ‘dynamic_grab_time_difference’.</w:t>
       </w:r>
     </w:p>
     <w:p>
@@ -5040,46 +3790,7 @@
         <w:t xml:space="preserve">f you wish to modify the static hand-detection method, focus on parameters </w:t>
       </w:r>
       <w:r>
-        <w:t>‘</w:t>
-      </w:r>
-      <w:proofErr w:type="spellStart"/>
-      <w:r>
-        <w:t>hand_status_buffer_size</w:t>
-      </w:r>
-      <w:proofErr w:type="spellEnd"/>
-      <w:proofErr w:type="gramStart"/>
-      <w:r>
-        <w:t>’ ,</w:t>
-      </w:r>
-      <w:proofErr w:type="gramEnd"/>
-      <w:r>
-        <w:t xml:space="preserve"> ‘</w:t>
-      </w:r>
-      <w:proofErr w:type="spellStart"/>
-      <w:r>
-        <w:t>hand_status_buffer_atleast</w:t>
-      </w:r>
-      <w:proofErr w:type="spellEnd"/>
-      <w:proofErr w:type="gramStart"/>
-      <w:r>
-        <w:t>’, ‘</w:t>
-      </w:r>
-      <w:proofErr w:type="spellStart"/>
-      <w:proofErr w:type="gramEnd"/>
-      <w:r>
-        <w:t>hand_open_thrashold</w:t>
-      </w:r>
-      <w:proofErr w:type="spellEnd"/>
-      <w:r>
-        <w:t>’ and ‘</w:t>
-      </w:r>
-      <w:proofErr w:type="spellStart"/>
-      <w:r>
-        <w:t>hand_close_thrashold</w:t>
-      </w:r>
-      <w:proofErr w:type="spellEnd"/>
-      <w:r>
-        <w:t>’.</w:t>
+        <w:t>‘hand_status_buffer_size’ , ‘hand_status_buffer_atleast’, ‘hand_open_thrashold’ and ‘hand_close_thrashold’.</w:t>
       </w:r>
     </w:p>
     <w:p>
@@ -5122,36 +3833,7 @@
         <w:pStyle w:val="Aufzhlungszeichen"/>
       </w:pPr>
       <w:r>
-        <w:t>The Python receive thread binds to `</w:t>
-      </w:r>
-      <w:proofErr w:type="spellStart"/>
-      <w:r>
-        <w:t>bind_</w:t>
-      </w:r>
-      <w:proofErr w:type="gramStart"/>
-      <w:r>
-        <w:t>ip:port</w:t>
-      </w:r>
-      <w:proofErr w:type="spellEnd"/>
-      <w:proofErr w:type="gramEnd"/>
-      <w:r>
-        <w:t>`; with `</w:t>
-      </w:r>
-      <w:proofErr w:type="spellStart"/>
-      <w:r>
-        <w:t>bind_ip</w:t>
-      </w:r>
-      <w:proofErr w:type="spellEnd"/>
-      <w:r>
-        <w:t xml:space="preserve"> = 0.0.0.0`, it listens on all local IPv4 interfaces. MATLAB scripts bind their local `</w:t>
-      </w:r>
-      <w:proofErr w:type="spellStart"/>
-      <w:r>
-        <w:t>udpport</w:t>
-      </w:r>
-      <w:proofErr w:type="spellEnd"/>
-      <w:r>
-        <w:t>` to port 5005 and send to `192.168.0.11:5005`.</w:t>
+        <w:t>The Python receive thread binds to `bind_ip:port`; with `bind_ip = 0.0.0.0`, it listens on all local IPv4 interfaces. MATLAB scripts bind their local `udpport` to port 5005 and send to `192.168.0.11:5005`.</w:t>
       </w:r>
     </w:p>
     <w:p>
@@ -5167,15 +3849,7 @@
         <w:pStyle w:val="Aufzhlungszeichen"/>
       </w:pPr>
       <w:r>
-        <w:t>Ensure both PCs are on a reachable network, use the correct IPv4 addresses, and allow inbound UDP port 5005 in the Windows firewall. A successful `</w:t>
-      </w:r>
-      <w:proofErr w:type="gramStart"/>
-      <w:r>
-        <w:t>write(</w:t>
-      </w:r>
-      <w:proofErr w:type="gramEnd"/>
-      <w:r>
-        <w:t>)` call does not prove that the other application received the packet.</w:t>
+        <w:t>Ensure both PCs are on a reachable network, use the correct IPv4 addresses, and allow inbound UDP port 5005 in the Windows firewall. A successful `write()` call does not prove that the other application received the packet.</w:t>
       </w:r>
     </w:p>
     <w:p>
@@ -5191,23 +3865,7 @@
         <w:pStyle w:val="Listennummer"/>
       </w:pPr>
       <w:r>
-        <w:t>Start `python main.py` on the video-system PC. It creates `</w:t>
-      </w:r>
-      <w:proofErr w:type="spellStart"/>
-      <w:r>
-        <w:t>SaveUdpToDict</w:t>
-      </w:r>
-      <w:proofErr w:type="spellEnd"/>
-      <w:r>
-        <w:t>`, which starts a background receive loop, and `</w:t>
-      </w:r>
-      <w:proofErr w:type="spellStart"/>
-      <w:r>
-        <w:t>SendOnChange</w:t>
-      </w:r>
-      <w:proofErr w:type="spellEnd"/>
-      <w:r>
-        <w:t>`, which sends changed GUI instrument state to the audio-system IP.</w:t>
+        <w:t>Start `python main.py` on the video-system PC. It creates `SaveUdpToDict`, which starts a background receive loop, and `SendOnChange`, which sends changed GUI instrument state to the audio-system IP.</w:t>
       </w:r>
     </w:p>
     <w:p>
@@ -5215,36 +3873,7 @@
         <w:pStyle w:val="Listennummer"/>
       </w:pPr>
       <w:r>
-        <w:t>Run a MATLAB sender/receiver script on the audio-system PC. It sends JSON such as `{"</w:t>
-      </w:r>
-      <w:proofErr w:type="spellStart"/>
-      <w:r>
-        <w:t>add_instruments</w:t>
-      </w:r>
-      <w:proofErr w:type="spellEnd"/>
-      <w:proofErr w:type="gramStart"/>
-      <w:r>
-        <w:t>":[</w:t>
-      </w:r>
-      <w:proofErr w:type="gramEnd"/>
-      <w:r>
-        <w:t>"</w:t>
-      </w:r>
-      <w:proofErr w:type="spellStart"/>
-      <w:r>
-        <w:t>piano","violin</w:t>
-      </w:r>
-      <w:proofErr w:type="spellEnd"/>
-      <w:r>
-        <w:t>"</w:t>
-      </w:r>
-      <w:proofErr w:type="gramStart"/>
-      <w:r>
-        <w:t>]}`</w:t>
-      </w:r>
-      <w:proofErr w:type="gramEnd"/>
-      <w:r>
-        <w:t xml:space="preserve"> to the video PC.</w:t>
+        <w:t>Run a MATLAB sender/receiver script on the audio-system PC. It sends JSON such as `{"add_instruments":["piano","violin"]}` to the video PC.</w:t>
       </w:r>
     </w:p>
     <w:p>
@@ -5252,23 +3881,7 @@
         <w:pStyle w:val="Listennummer"/>
       </w:pPr>
       <w:r>
-        <w:t>The Python receive loop decodes the JSON and queues it. `main.py` reads the queued `</w:t>
-      </w:r>
-      <w:proofErr w:type="spellStart"/>
-      <w:r>
-        <w:t>add_instruments</w:t>
-      </w:r>
-      <w:proofErr w:type="spellEnd"/>
-      <w:r>
-        <w:t>` field and calls `</w:t>
-      </w:r>
-      <w:proofErr w:type="spellStart"/>
-      <w:r>
-        <w:t>gui.add_instrument</w:t>
-      </w:r>
-      <w:proofErr w:type="spellEnd"/>
-      <w:r>
-        <w:t>(...)` for each name.</w:t>
+        <w:t>The Python receive loop decodes the JSON and queues it. `main.py` reads the queued `add_instruments` field and calls `gui.add_instrument(...)` for each name.</w:t>
       </w:r>
     </w:p>
     <w:p>
@@ -5276,15 +3889,7 @@
         <w:pStyle w:val="Listennummer"/>
       </w:pPr>
       <w:r>
-        <w:t>When an instrument is selected and moved/released, the GUI exposes its current state. `</w:t>
-      </w:r>
-      <w:proofErr w:type="spellStart"/>
-      <w:r>
-        <w:t>SendOnChange</w:t>
-      </w:r>
-      <w:proofErr w:type="spellEnd"/>
-      <w:r>
-        <w:t>` serializes and sends the changed state as JSON to the audio-system PC.</w:t>
+        <w:t>When an instrument is selected and moved/released, the GUI exposes its current state. `SendOnChange` serializes and sends the changed state as JSON to the audio-system PC.</w:t>
       </w:r>
     </w:p>
     <w:p>
@@ -5292,15 +3897,7 @@
         <w:pStyle w:val="Listennummer"/>
       </w:pPr>
       <w:r>
-        <w:t>MATLAB reads incoming datagrams, converts UTF-8 bytes to text, applies `</w:t>
-      </w:r>
-      <w:proofErr w:type="spellStart"/>
-      <w:r>
-        <w:t>jsondecode</w:t>
-      </w:r>
-      <w:proofErr w:type="spellEnd"/>
-      <w:r>
-        <w:t>`, and prints the decoded structure. Replace the print statement with the audio engine's parameter-update function when integrating the real audio system.</w:t>
+        <w:t>MATLAB reads incoming datagrams, converts UTF-8 bytes to text, applies `jsondecode`, and prints the decoded structure. Replace the print statement with the audio engine's parameter-update function when integrating the real audio system.</w:t>
       </w:r>
     </w:p>
     <w:p>
@@ -5316,31 +3913,7 @@
         <w:pStyle w:val="Listennummer"/>
       </w:pPr>
       <w:r>
-        <w:t>Check and record the actual IPv4 addresses on both PCs. Update `IPv4_audiosystem`, `IPv4_videosystem`, `</w:t>
-      </w:r>
-      <w:proofErr w:type="spellStart"/>
-      <w:r>
-        <w:t>targetIp</w:t>
-      </w:r>
-      <w:proofErr w:type="spellEnd"/>
-      <w:r>
-        <w:t>`, `</w:t>
-      </w:r>
-      <w:proofErr w:type="spellStart"/>
-      <w:r>
-        <w:t>targetPort</w:t>
-      </w:r>
-      <w:proofErr w:type="spellEnd"/>
-      <w:r>
-        <w:t>`, and `</w:t>
-      </w:r>
-      <w:proofErr w:type="spellStart"/>
-      <w:r>
-        <w:t>localPort</w:t>
-      </w:r>
-      <w:proofErr w:type="spellEnd"/>
-      <w:r>
-        <w:t>` as needed.</w:t>
+        <w:t>Check and record the actual IPv4 addresses on both PCs. Update `IPv4_audiosystem`, `IPv4_videosystem`, `targetIp`, `targetPort`, and `localPort` as needed.</w:t>
       </w:r>
     </w:p>
     <w:p>
@@ -5364,15 +3937,7 @@
         <w:pStyle w:val="Listennummer"/>
       </w:pPr>
       <w:r>
-        <w:t>Run `</w:t>
-      </w:r>
-      <w:proofErr w:type="spellStart"/>
-      <w:r>
-        <w:t>UDP_send_instruments_then_receiv_orders.m</w:t>
-      </w:r>
-      <w:proofErr w:type="spellEnd"/>
-      <w:r>
-        <w:t>` in MATLAB. The instrument names should appear in the GUI; MATLAB should print any UDP messages sent back by Python when instrument state changes.</w:t>
+        <w:t>Run `UDP_send_instruments_then_receiv_orders.m` in MATLAB. The instrument names should appear in the GUI; MATLAB should print any UDP messages sent back by Python when instrument state changes.</w:t>
       </w:r>
     </w:p>
     <w:p>
@@ -5408,23 +3973,7 @@
         <w:pStyle w:val="Listennummer"/>
       </w:pPr>
       <w:r>
-        <w:t>If nothing arrives, verify IP/port, firewall, that the Python receiver thread is running, and that no other process already occupies local UDP port 5005. On Windows, `netstat -</w:t>
-      </w:r>
-      <w:proofErr w:type="spellStart"/>
-      <w:r>
-        <w:t>ano</w:t>
-      </w:r>
-      <w:proofErr w:type="spellEnd"/>
-      <w:r>
-        <w:t xml:space="preserve"> | </w:t>
-      </w:r>
-      <w:proofErr w:type="spellStart"/>
-      <w:r>
-        <w:t>findstr</w:t>
-      </w:r>
-      <w:proofErr w:type="spellEnd"/>
-      <w:r>
-        <w:t xml:space="preserve"> :5005` helps identify the PID holding the port.</w:t>
+        <w:t>If nothing arrives, verify IP/port, firewall, that the Python receiver thread is running, and that no other process already occupies local UDP port 5005. On Windows, `netstat -ano | findstr :5005` helps identify the PID holding the port.</w:t>
       </w:r>
     </w:p>
     <w:p>
@@ -5487,11 +4036,9 @@
             <w:tcW w:w="4999" w:type="dxa"/>
           </w:tcPr>
           <w:p>
-            <w:proofErr w:type="spellStart"/>
             <w:r>
               <w:t>send_udp.m</w:t>
             </w:r>
-            <w:proofErr w:type="spellEnd"/>
           </w:p>
         </w:tc>
         <w:tc>
@@ -5518,11 +4065,9 @@
             <w:tcW w:w="4999" w:type="dxa"/>
           </w:tcPr>
           <w:p>
-            <w:proofErr w:type="spellStart"/>
             <w:r>
               <w:t>receiv_udp.m</w:t>
             </w:r>
-            <w:proofErr w:type="spellEnd"/>
           </w:p>
         </w:tc>
         <w:tc>
@@ -5550,11 +4095,9 @@
             <w:tcW w:w="4999" w:type="dxa"/>
           </w:tcPr>
           <w:p>
-            <w:proofErr w:type="spellStart"/>
             <w:r>
               <w:t>UDP_send_instruments_then_receiv_orders.m</w:t>
             </w:r>
-            <w:proofErr w:type="spellEnd"/>
           </w:p>
         </w:tc>
         <w:tc>
@@ -5566,15 +4109,7 @@
               <w:cnfStyle w:val="000000100000" w:firstRow="0" w:lastRow="0" w:firstColumn="0" w:lastColumn="0" w:oddVBand="0" w:evenVBand="0" w:oddHBand="1" w:evenHBand="0" w:firstRowFirstColumn="0" w:firstRowLastColumn="0" w:lastRowFirstColumn="0" w:lastRowLastColumn="0"/>
             </w:pPr>
             <w:r>
-              <w:t xml:space="preserve">Recommended basic round-trip </w:t>
-            </w:r>
-            <w:proofErr w:type="gramStart"/>
-            <w:r>
-              <w:t>test:</w:t>
-            </w:r>
-            <w:proofErr w:type="gramEnd"/>
-            <w:r>
-              <w:t xml:space="preserve"> sends a fixed instrument list and continuously receives responses.</w:t>
+              <w:t>Recommended basic round-trip test: sends a fixed instrument list and continuously receives responses.</w:t>
             </w:r>
           </w:p>
         </w:tc>
@@ -5589,11 +4124,9 @@
             <w:tcW w:w="4999" w:type="dxa"/>
           </w:tcPr>
           <w:p>
-            <w:proofErr w:type="spellStart"/>
             <w:r>
               <w:t>UDP_send_instruments_per_comandline_and_reseiv.m</w:t>
             </w:r>
-            <w:proofErr w:type="spellEnd"/>
           </w:p>
         </w:tc>
         <w:tc>
@@ -5605,15 +4138,7 @@
               <w:cnfStyle w:val="000000000000" w:firstRow="0" w:lastRow="0" w:firstColumn="0" w:lastColumn="0" w:oddVBand="0" w:evenVBand="0" w:oddHBand="0" w:evenHBand="0" w:firstRowFirstColumn="0" w:firstRowLastColumn="0" w:lastRowFirstColumn="0" w:lastRowLastColumn="0"/>
             </w:pPr>
             <w:r>
-              <w:t xml:space="preserve">Interactive test: adds one instrument name per prompt and receives responses. Since </w:t>
-            </w:r>
-            <w:proofErr w:type="gramStart"/>
-            <w:r>
-              <w:t>input(</w:t>
-            </w:r>
-            <w:proofErr w:type="gramEnd"/>
-            <w:r>
-              <w:t>) blocks, received messages are only processed after the user returns to the loop.</w:t>
+              <w:t>Interactive test: adds one instrument name per prompt and receives responses. Since input() blocks, received messages are only processed after the user returns to the loop.</w:t>
             </w:r>
           </w:p>
         </w:tc>
@@ -5633,15 +4158,7 @@
     </w:p>
     <w:p>
       <w:r>
-        <w:t>The available instrument tiles can be provided by the MATLAB/audio-system application over UDP. When the communication is configured, the audio system sends a JSON message using the key `</w:t>
-      </w:r>
-      <w:proofErr w:type="spellStart"/>
-      <w:r>
-        <w:t>add_instruments</w:t>
-      </w:r>
-      <w:proofErr w:type="spellEnd"/>
-      <w:r>
-        <w:t xml:space="preserve">`, for example an array containing instrument names. For example: </w:t>
+        <w:t xml:space="preserve">The available instrument tiles can be provided by the MATLAB/audio-system application over UDP. When the communication is configured, the audio system sends a JSON message using the key `add_instruments`, for example an array containing instrument names. For example: </w:t>
       </w:r>
       <w:r>
         <w:t>["trumpet", "trumpet</w:t>
@@ -5676,28 +4193,12 @@
         <w:t>.py</w:t>
       </w:r>
       <w:r>
-        <w:t xml:space="preserve"> file under `</w:t>
-      </w:r>
-      <w:proofErr w:type="spellStart"/>
-      <w:r>
-        <w:t>start_instruments</w:t>
-      </w:r>
-      <w:proofErr w:type="spellEnd"/>
-      <w:r>
-        <w:t>`.</w:t>
+        <w:t xml:space="preserve"> file under `start_instruments`.</w:t>
       </w:r>
     </w:p>
     <w:p>
       <w:r>
-        <w:t xml:space="preserve">The 'icons' folder contains </w:t>
-      </w:r>
-      <w:proofErr w:type="gramStart"/>
-      <w:r>
-        <w:t>the image</w:t>
-      </w:r>
-      <w:proofErr w:type="gramEnd"/>
-      <w:r>
-        <w:t xml:space="preserve"> files for all GUI tiles. When a new instrument is added, the system automatically checks whether a suitable image for that instrument exists in this folder. It selects the first image that includes the full instrument name in its title.</w:t>
+        <w:t>The 'icons' folder contains the image files for all GUI tiles. When a new instrument is added, the system automatically checks whether a suitable image for that instrument exists in this folder. It selects the first image that includes the full instrument name in its title.</w:t>
       </w:r>
       <w:r>
         <w:t xml:space="preserve"> </w:t>
@@ -5714,15 +4215,7 @@
         <w:t>10</w:t>
       </w:r>
       <w:r>
-        <w:t xml:space="preserve">. </w:t>
-      </w:r>
-      <w:proofErr w:type="spellStart"/>
-      <w:r>
-        <w:t>Adjrust</w:t>
-      </w:r>
-      <w:proofErr w:type="spellEnd"/>
-      <w:r>
-        <w:t xml:space="preserve"> GUI menu tiles and information</w:t>
+        <w:t>. Adjrust GUI menu tiles and information</w:t>
       </w:r>
     </w:p>
     <w:p>
@@ -5739,15 +4232,7 @@
         <w:t>’</w:t>
       </w:r>
       <w:r>
-        <w:t xml:space="preserve"> contains the information displayed in the info window, which is opened either by the info gesture, info button or by pressing the I key. The icons for the instrument menu and the info button </w:t>
-      </w:r>
-      <w:proofErr w:type="gramStart"/>
-      <w:r>
-        <w:t>are located in</w:t>
-      </w:r>
-      <w:proofErr w:type="gramEnd"/>
-      <w:r>
-        <w:t xml:space="preserve"> the icons folder. If you want to adjust any of them</w:t>
+        <w:t xml:space="preserve"> contains the information displayed in the info window, which is opened either by the info gesture, info button or by pressing the I key. The icons for the instrument menu and the info button are located in the icons folder. If you want to adjust any of them</w:t>
       </w:r>
       <w:r>
         <w:t xml:space="preserve">, </w:t>
@@ -5790,11 +4275,9 @@
       <w:r>
         <w:t>‘</w:t>
       </w:r>
-      <w:proofErr w:type="spellStart"/>
       <w:r>
         <w:t>VolumeBar</w:t>
       </w:r>
-      <w:proofErr w:type="spellEnd"/>
       <w:r>
         <w:t>’</w:t>
       </w:r>
@@ -5833,15 +4316,7 @@
         <w:pStyle w:val="Aufzhlungszeichen"/>
       </w:pPr>
       <w:r>
-        <w:t xml:space="preserve">The supplied Python source starts a receive thread and calls a </w:t>
-      </w:r>
-      <w:proofErr w:type="gramStart"/>
-      <w:r>
-        <w:t>receive</w:t>
-      </w:r>
-      <w:proofErr w:type="gramEnd"/>
-      <w:r>
-        <w:t xml:space="preserve"> function that binds to port 5005. Do not start multiple application instances or multiple receive loops on the same local port.</w:t>
+        <w:t>The supplied Python source starts a receive thread and calls a receive function that binds to port 5005. Do not start multiple application instances or multiple receive loops on the same local port.</w:t>
       </w:r>
     </w:p>
     <w:p>
@@ -6016,7 +4491,7 @@
   <w:abstractNum w:abstractNumId="7" w15:restartNumberingAfterBreak="0">
     <w:nsid w:val="FFFFFF88"/>
     <w:multiLevelType w:val="singleLevel"/>
-    <w:tmpl w:val="386A9336"/>
+    <w:tmpl w:val="E25C5D88"/>
     <w:lvl w:ilvl="0">
       <w:start w:val="1"/>
       <w:numFmt w:val="decimal"/>
@@ -6080,6 +4555,9 @@
     <w:abstractNumId w:val="0"/>
   </w:num>
   <w:num w:numId="10" w16cid:durableId="1794247283">
+    <w:abstractNumId w:val="7"/>
+  </w:num>
+  <w:num w:numId="11" w16cid:durableId="1831602469">
     <w:abstractNumId w:val="7"/>
   </w:num>
 </w:numbering>

</xml_diff>